<commit_message>
Giao diện tiếng Việt phục vụ tra cứu dữ liệu pin và so sánh kết quả mô hình
</commit_message>
<xml_diff>
--- a/docs/bao-cao-khoa-luan.docx
+++ b/docs/bao-cao-khoa-luan.docx
@@ -5714,20 +5714,102 @@
     </w:p>
     <w:p>
       <w:r>
-        <w:t>Ứng dụng Streamlit có ba phần: xem dữ liệu, xem kết quả kiểm thử, tải CSV một chu kỳ để dự đoán. Đầu vào yêu cầu time, terminal_voltage, terminal_current và temperature; cycle nhập riêng hoặc phải nhất quán với CSV. Dữ liệu không đủ cửa sổ hoặc sai cấu trúc được báo lỗi bằng thông điệp cụ thể.</w:t>
+        <w:t>Ứng dụng PinLab xây dựng bằng Streamlit có năm mục: Tổng quan, Tra cứu pin, Đánh giá mô hình, Dự đoán SOH và Hồ sơ đề tài. Giao diện có thanh điều hướng, các bảng và biểu đồ tương tác với nhãn tiếng Việt. Thông tin người thực hiện là Nguyễn Văn Duy, MSSV 2311553949, chuyên ngành Khoa Học Dữ Liệu. Đầu vào yêu cầu time, terminal_voltage, terminal_current và temperature; cycle nhập riêng hoặc phải nhất quán với CSV. Dữ liệu không đủ cửa sổ hoặc sai cấu trúc được báo lỗi bằng thông điệp cụ thể.</w:t>
       </w:r>
     </w:p>
     <w:p>
       <w:r>
-        <w:t>Ứng dụng cảnh báo khi đặc trưng ngoài miền huấn luyện, cho tải mẫu và kết quả dự đoán. Dự đoán chỉ lưu từ mô hình cục bộ do pipeline tạo; không nhận file mô hình joblib từ người dùng. Đây là phần mềm nghiên cứu, không đưa ra quyết định thay pin hoặc chứng nhận an toàn.</w:t>
+        <w:t>Trang tra cứu cho chọn nhiều pin, lọc khoảng chu kỳ và xem điện áp, dòng, nhiệt độ của một chu kỳ. Trang đánh giá cho chọn mô hình và pin kiểm thử, đối chiếu SOH thực tế–dự đoán và tải bảng tiếng Việt. Trang dự đoán nhận cả tên cột gốc hoặc tên tiếng Việt, từ chối file trộn nhiều pin/chu kỳ, giữ kết quả khi tải và ẩn kết quả cũ khi thay đầu vào. Ứng dụng cảnh báo khi đặc trưng ngoài miền huấn luyện, cho tải mẫu và kết quả dự đoán. Dự đoán chỉ lưu từ mô hình cục bộ do pipeline tạo; không nhận file mô hình joblib từ người dùng. Đây là phần mềm nghiên cứu, không đưa ra quyết định thay pin hoặc chứng nhận an toàn.</w:t>
       </w:r>
     </w:p>
     <w:p>
       <w:r>
         <w:drawing>
           <wp:inline xmlns:a="http://schemas.openxmlformats.org/drawingml/2006/main" xmlns:pic="http://schemas.openxmlformats.org/drawingml/2006/picture">
-            <wp:extent cx="5580000" cy="4262500"/>
+            <wp:extent cx="5580000" cy="5535714"/>
             <wp:docPr id="4" name="Picture 4"/>
+            <wp:cNvGraphicFramePr>
+              <a:graphicFrameLocks noChangeAspect="1"/>
+            </wp:cNvGraphicFramePr>
+            <a:graphic>
+              <a:graphicData uri="http://schemas.openxmlformats.org/drawingml/2006/picture">
+                <pic:pic>
+                  <pic:nvPicPr>
+                    <pic:cNvPr id="0" name="00-tong-quan.png"/>
+                    <pic:cNvPicPr/>
+                  </pic:nvPicPr>
+                  <pic:blipFill>
+                    <a:blip r:embed="rId13"/>
+                    <a:stretch>
+                      <a:fillRect/>
+                    </a:stretch>
+                  </pic:blipFill>
+                  <pic:spPr>
+                    <a:xfrm>
+                      <a:off x="0" y="0"/>
+                      <a:ext cx="5580000" cy="5535714"/>
+                    </a:xfrm>
+                    <a:prstGeom prst="rect"/>
+                  </pic:spPr>
+                </pic:pic>
+              </a:graphicData>
+            </a:graphic>
+          </wp:inline>
+        </w:drawing>
+      </w:r>
+    </w:p>
+    <w:p>
+      <w:r>
+        <w:t>Tổng quan PinLab và thông tin sinh viên</w:t>
+      </w:r>
+    </w:p>
+    <w:p>
+      <w:r>
+        <w:drawing>
+          <wp:inline xmlns:a="http://schemas.openxmlformats.org/drawingml/2006/main" xmlns:pic="http://schemas.openxmlformats.org/drawingml/2006/picture">
+            <wp:extent cx="5580000" cy="5535714"/>
+            <wp:docPr id="5" name="Picture 5"/>
+            <wp:cNvGraphicFramePr>
+              <a:graphicFrameLocks noChangeAspect="1"/>
+            </wp:cNvGraphicFramePr>
+            <a:graphic>
+              <a:graphicData uri="http://schemas.openxmlformats.org/drawingml/2006/picture">
+                <pic:pic>
+                  <pic:nvPicPr>
+                    <pic:cNvPr id="0" name="03-danh-gia.png"/>
+                    <pic:cNvPicPr/>
+                  </pic:nvPicPr>
+                  <pic:blipFill>
+                    <a:blip r:embed="rId14"/>
+                    <a:stretch>
+                      <a:fillRect/>
+                    </a:stretch>
+                  </pic:blipFill>
+                  <pic:spPr>
+                    <a:xfrm>
+                      <a:off x="0" y="0"/>
+                      <a:ext cx="5580000" cy="5535714"/>
+                    </a:xfrm>
+                    <a:prstGeom prst="rect"/>
+                  </pic:spPr>
+                </pic:pic>
+              </a:graphicData>
+            </a:graphic>
+          </wp:inline>
+        </w:drawing>
+      </w:r>
+    </w:p>
+    <w:p>
+      <w:r>
+        <w:t>Giao diện đánh giá mô hình</w:t>
+      </w:r>
+    </w:p>
+    <w:p>
+      <w:r>
+        <w:drawing>
+          <wp:inline xmlns:a="http://schemas.openxmlformats.org/drawingml/2006/main" xmlns:pic="http://schemas.openxmlformats.org/drawingml/2006/picture">
+            <wp:extent cx="5580000" cy="5535714"/>
+            <wp:docPr id="6" name="Picture 6"/>
             <wp:cNvGraphicFramePr>
               <a:graphicFrameLocks noChangeAspect="1"/>
             </wp:cNvGraphicFramePr>
@@ -5739,7 +5821,7 @@
                     <pic:cNvPicPr/>
                   </pic:nvPicPr>
                   <pic:blipFill>
-                    <a:blip r:embed="rId13"/>
+                    <a:blip r:embed="rId15"/>
                     <a:stretch>
                       <a:fillRect/>
                     </a:stretch>
@@ -5747,7 +5829,7 @@
                   <pic:spPr>
                     <a:xfrm>
                       <a:off x="0" y="0"/>
-                      <a:ext cx="5580000" cy="4262500"/>
+                      <a:ext cx="5580000" cy="5535714"/>
                     </a:xfrm>
                     <a:prstGeom prst="rect"/>
                   </pic:spPr>
@@ -5767,8 +5849,8 @@
       <w:r>
         <w:drawing>
           <wp:inline xmlns:a="http://schemas.openxmlformats.org/drawingml/2006/main" xmlns:pic="http://schemas.openxmlformats.org/drawingml/2006/picture">
-            <wp:extent cx="5580000" cy="4262500"/>
-            <wp:docPr id="5" name="Picture 5"/>
+            <wp:extent cx="5580000" cy="5535714"/>
+            <wp:docPr id="7" name="Picture 7"/>
             <wp:cNvGraphicFramePr>
               <a:graphicFrameLocks noChangeAspect="1"/>
             </wp:cNvGraphicFramePr>
@@ -5780,7 +5862,7 @@
                     <pic:cNvPicPr/>
                   </pic:nvPicPr>
                   <pic:blipFill>
-                    <a:blip r:embed="rId14"/>
+                    <a:blip r:embed="rId16"/>
                     <a:stretch>
                       <a:fillRect/>
                     </a:stretch>
@@ -5788,7 +5870,7 @@
                   <pic:spPr>
                     <a:xfrm>
                       <a:off x="0" y="0"/>
-                      <a:ext cx="5580000" cy="4262500"/>
+                      <a:ext cx="5580000" cy="5535714"/>
                     </a:xfrm>
                     <a:prstGeom prst="rect"/>
                   </pic:spPr>

</xml_diff>

<commit_message>
Vincent D: dự đoán SOH từng chu kỳ hoặc theo lô, tra cứu lịch sử và xuất báo cáo kết quả
</commit_message>
<xml_diff>
--- a/docs/bao-cao-khoa-luan.docx
+++ b/docs/bao-cao-khoa-luan.docx
@@ -27,7 +27,7 @@
     </w:p>
     <w:p>
       <w:r>
-        <w:t>Báo cáo nghiên cứu để sinh viên kiểm tra và trao đổi với giảng viên. Chưa có mẫu trình bày chính thức hoặc xác nhận nghiệm thu. Không tạo thay chữ ký, nhận xét, lời cam đoan hoặc kết quả phê duyệt.</w:t>
+        <w:t>Báo cáo nghiên cứu — sản phẩm Vincent D.</w:t>
       </w:r>
     </w:p>
     <w:p>
@@ -5714,7 +5714,7 @@
     </w:p>
     <w:p>
       <w:r>
-        <w:t>Ứng dụng PinLab xây dựng bằng Streamlit có năm mục: Tổng quan, Tra cứu pin, Đánh giá mô hình, Dự đoán SOH và Hồ sơ đề tài. Giao diện có thanh điều hướng, các bảng và biểu đồ tương tác với nhãn tiếng Việt. Thông tin người thực hiện là Nguyễn Văn Duy, MSSV 2311553949, chuyên ngành Khoa Học Dữ Liệu. Đầu vào yêu cầu time, terminal_voltage, terminal_current và temperature; cycle nhập riêng hoặc phải nhất quán với CSV. Dữ liệu không đủ cửa sổ hoặc sai cấu trúc được báo lỗi bằng thông điệp cụ thể.</w:t>
+        <w:t>Ứng dụng Vincent D xây dựng bằng Streamlit có sáu mục: Tổng quan, Tra cứu pin, Đánh giá mô hình, Dự đoán SOH, Lịch sử dự đoán và Thông tin. Giao diện sử dụng Arial, thanh điều hướng, các bảng và biểu đồ tiếng Việt. Có so sánh hai chu kỳ, dự đoán theo lô tối đa 100 chu kỳ, lịch sử phiên tối đa 500 chu kỳ và phiếu kết quả HTML tự chứa có thể in thành PDF bằng trình duyệt. Nhóm dữ liệu lỗi được báo riêng; không tự tạo điểm tin cậy dự đoán. Thông tin người thực hiện là Nguyễn Văn Duy, MSSV 2311553949, chuyên ngành Khoa Học Dữ Liệu. Đầu vào yêu cầu time, terminal_voltage, terminal_current và temperature; cycle nhập riêng hoặc phải nhất quán với CSV. Dữ liệu không đủ cửa sổ hoặc sai cấu trúc được báo lỗi bằng thông điệp cụ thể.</w:t>
       </w:r>
     </w:p>
     <w:p>
@@ -5726,7 +5726,7 @@
       <w:r>
         <w:drawing>
           <wp:inline xmlns:a="http://schemas.openxmlformats.org/drawingml/2006/main" xmlns:pic="http://schemas.openxmlformats.org/drawingml/2006/picture">
-            <wp:extent cx="5580000" cy="5535714"/>
+            <wp:extent cx="5580000" cy="5166667"/>
             <wp:docPr id="4" name="Picture 4"/>
             <wp:cNvGraphicFramePr>
               <a:graphicFrameLocks noChangeAspect="1"/>
@@ -5747,7 +5747,7 @@
                   <pic:spPr>
                     <a:xfrm>
                       <a:off x="0" y="0"/>
-                      <a:ext cx="5580000" cy="5535714"/>
+                      <a:ext cx="5580000" cy="5166667"/>
                     </a:xfrm>
                     <a:prstGeom prst="rect"/>
                   </pic:spPr>
@@ -5760,14 +5760,14 @@
     </w:p>
     <w:p>
       <w:r>
-        <w:t>Tổng quan PinLab và thông tin sinh viên</w:t>
+        <w:t>Tổng quan Vincent D và thông tin sinh viên</w:t>
       </w:r>
     </w:p>
     <w:p>
       <w:r>
         <w:drawing>
           <wp:inline xmlns:a="http://schemas.openxmlformats.org/drawingml/2006/main" xmlns:pic="http://schemas.openxmlformats.org/drawingml/2006/picture">
-            <wp:extent cx="5580000" cy="5535714"/>
+            <wp:extent cx="5580000" cy="5166667"/>
             <wp:docPr id="5" name="Picture 5"/>
             <wp:cNvGraphicFramePr>
               <a:graphicFrameLocks noChangeAspect="1"/>
@@ -5788,7 +5788,7 @@
                   <pic:spPr>
                     <a:xfrm>
                       <a:off x="0" y="0"/>
-                      <a:ext cx="5580000" cy="5535714"/>
+                      <a:ext cx="5580000" cy="5166667"/>
                     </a:xfrm>
                     <a:prstGeom prst="rect"/>
                   </pic:spPr>
@@ -5808,7 +5808,7 @@
       <w:r>
         <w:drawing>
           <wp:inline xmlns:a="http://schemas.openxmlformats.org/drawingml/2006/main" xmlns:pic="http://schemas.openxmlformats.org/drawingml/2006/picture">
-            <wp:extent cx="5580000" cy="5535714"/>
+            <wp:extent cx="5580000" cy="5166667"/>
             <wp:docPr id="6" name="Picture 6"/>
             <wp:cNvGraphicFramePr>
               <a:graphicFrameLocks noChangeAspect="1"/>
@@ -5829,7 +5829,7 @@
                   <pic:spPr>
                     <a:xfrm>
                       <a:off x="0" y="0"/>
-                      <a:ext cx="5580000" cy="5535714"/>
+                      <a:ext cx="5580000" cy="5166667"/>
                     </a:xfrm>
                     <a:prstGeom prst="rect"/>
                   </pic:spPr>
@@ -5849,7 +5849,7 @@
       <w:r>
         <w:drawing>
           <wp:inline xmlns:a="http://schemas.openxmlformats.org/drawingml/2006/main" xmlns:pic="http://schemas.openxmlformats.org/drawingml/2006/picture">
-            <wp:extent cx="5580000" cy="5535714"/>
+            <wp:extent cx="5580000" cy="5166667"/>
             <wp:docPr id="7" name="Picture 7"/>
             <wp:cNvGraphicFramePr>
               <a:graphicFrameLocks noChangeAspect="1"/>
@@ -5870,7 +5870,7 @@
                   <pic:spPr>
                     <a:xfrm>
                       <a:off x="0" y="0"/>
-                      <a:ext cx="5580000" cy="5535714"/>
+                      <a:ext cx="5580000" cy="5166667"/>
                     </a:xfrm>
                     <a:prstGeom prst="rect"/>
                   </pic:spPr>
@@ -5884,6 +5884,88 @@
     <w:p>
       <w:r>
         <w:t>Giao diện nhận CSV và dự đoán chạy thực tế</w:t>
+      </w:r>
+    </w:p>
+    <w:p>
+      <w:r>
+        <w:drawing>
+          <wp:inline xmlns:a="http://schemas.openxmlformats.org/drawingml/2006/main" xmlns:pic="http://schemas.openxmlformats.org/drawingml/2006/picture">
+            <wp:extent cx="5580000" cy="5166667"/>
+            <wp:docPr id="8" name="Picture 8"/>
+            <wp:cNvGraphicFramePr>
+              <a:graphicFrameLocks noChangeAspect="1"/>
+            </wp:cNvGraphicFramePr>
+            <a:graphic>
+              <a:graphicData uri="http://schemas.openxmlformats.org/drawingml/2006/picture">
+                <pic:pic>
+                  <pic:nvPicPr>
+                    <pic:cNvPr id="0" name="04-theo-lo.png"/>
+                    <pic:cNvPicPr/>
+                  </pic:nvPicPr>
+                  <pic:blipFill>
+                    <a:blip r:embed="rId17"/>
+                    <a:stretch>
+                      <a:fillRect/>
+                    </a:stretch>
+                  </pic:blipFill>
+                  <pic:spPr>
+                    <a:xfrm>
+                      <a:off x="0" y="0"/>
+                      <a:ext cx="5580000" cy="5166667"/>
+                    </a:xfrm>
+                    <a:prstGeom prst="rect"/>
+                  </pic:spPr>
+                </pic:pic>
+              </a:graphicData>
+            </a:graphic>
+          </wp:inline>
+        </w:drawing>
+      </w:r>
+    </w:p>
+    <w:p>
+      <w:r>
+        <w:t>Xử lý theo lô và báo nhóm dữ liệu không hợp lệ</w:t>
+      </w:r>
+    </w:p>
+    <w:p>
+      <w:r>
+        <w:drawing>
+          <wp:inline xmlns:a="http://schemas.openxmlformats.org/drawingml/2006/main" xmlns:pic="http://schemas.openxmlformats.org/drawingml/2006/picture">
+            <wp:extent cx="5580000" cy="5166667"/>
+            <wp:docPr id="9" name="Picture 9"/>
+            <wp:cNvGraphicFramePr>
+              <a:graphicFrameLocks noChangeAspect="1"/>
+            </wp:cNvGraphicFramePr>
+            <a:graphic>
+              <a:graphicData uri="http://schemas.openxmlformats.org/drawingml/2006/picture">
+                <pic:pic>
+                  <pic:nvPicPr>
+                    <pic:cNvPr id="0" name="05-lich-su.png"/>
+                    <pic:cNvPicPr/>
+                  </pic:nvPicPr>
+                  <pic:blipFill>
+                    <a:blip r:embed="rId18"/>
+                    <a:stretch>
+                      <a:fillRect/>
+                    </a:stretch>
+                  </pic:blipFill>
+                  <pic:spPr>
+                    <a:xfrm>
+                      <a:off x="0" y="0"/>
+                      <a:ext cx="5580000" cy="5166667"/>
+                    </a:xfrm>
+                    <a:prstGeom prst="rect"/>
+                  </pic:spPr>
+                </pic:pic>
+              </a:graphicData>
+            </a:graphic>
+          </wp:inline>
+        </w:drawing>
+      </w:r>
+    </w:p>
+    <w:p>
+      <w:r>
+        <w:t>Lịch sử kết quả trong phiên</w:t>
       </w:r>
     </w:p>
     <w:p>
@@ -5964,12 +6046,12 @@
         <w:pStyle w:val="Heading2"/>
       </w:pPr>
       <w:r>
-        <w:t>5.3. Điều kiện trước khi nộp chính thức</w:t>
+        <w:t>5.3. Phạm vi xác nhận</w:t>
       </w:r>
     </w:p>
     <w:p>
       <w:r>
-        <w:t>Sinh viên cần hiểu, chạy lại và giải thích mã; đối chiếu yêu cầu giảng viên về nguồn dữ liệu, tổng quan chuyên ngành, số trang, mẫu trình bày và trích dẫn. Báo cáo hiện tại không có xác nhận nghiệm thu. Các đề xuất phương pháp và thư viện không được thay thế cho việc sinh viên kiểm chứng nội dung và tuân thủ quy định học thuật của trường.</w:t>
+        <w:t>Kết quả được xác nhận trong phạm vi bộ dữ liệu và thiết kế thực nghiệm đã mô tả. Chưa có kiểm thử vận hành trên xe thực tế, dữ liệu Việt Nam hoặc xác nhận nghiệm thu học thuật.</w:t>
       </w:r>
     </w:p>
     <w:p>
@@ -6483,7 +6565,7 @@
     </w:p>
     <w:p>
       <w:r>
-        <w:t>Xem docs/giai-thich-code.md để đi theo luồng mã và docs/huong-dan-bao-ve.md để thực hành trình bày. Dự đoán trên CSV mẫu của demo không được dùng thay điểm test độc lập.</w:t>
+        <w:t>Dự đoán trên CSV mẫu của demo không được dùng thay điểm test độc lập.</w:t>
       </w:r>
     </w:p>
     <w:sectPr>

</xml_diff>

<commit_message>
Tra cứu dữ liệu SDU và dự đoán SOH từ CSV dung lượng lớn
10.505.065 dòng theo quy tắc lấy mỗi ba điểm, giữ đủ chu kỳ và cửa sổ mô hình. CSV/GZ tới 512 MiB, tên cột gốc SDU, 2.000 chu kỳ mỗi lô. Tiêu đề đề tài đầy đủ, Arial và nội dung giao diện gọn hơn. 47 kiểm thử đạt; file lớn nhất dự đoán đủ 1.321 chu kỳ.
</commit_message>
<xml_diff>
--- a/docs/bao-cao-khoa-luan.docx
+++ b/docs/bao-cao-khoa-luan.docx
@@ -211,7 +211,7 @@
     </w:p>
     <w:p>
       <w:r>
-        <w:t>Tôi sử dụng dữ liệu SDU do Wang, Gao và Tian công bố trên Zenodo năm 2025 [1]. Tập nguồn có 145.112.317 dòng đo của 86 tế bào pin, gồm sử dụng ban đầu và tái sử dụng. Sau nhận diện điều kiện xả tham chiếu, bộ được chọn có 30.929.675 dòng và 20.823 chu kỳ. Bản dùng trong sản phẩm giữ 10.000.000 dòng, đủ 86 pin và đủ các chu kỳ đã chọn; mọi điểm trong cửa sổ đầu xả được giữ nguyên. Giảm mật độ sau 120 giây giúp giảm dung lượng lưu trữ, không được coi là loại bỏ nhiễu.</w:t>
+        <w:t>Tôi sử dụng dữ liệu SDU do Wang, Gao và Tian công bố trên Zenodo năm 2025 [1]. Tập nguồn có 145.112.317 dòng đo của 86 tế bào pin, gồm sử dụng ban đầu và tái sử dụng. Sau nhận diện điều kiện xả tham chiếu, bộ được chọn có 30.929.675 dòng và 20.823 chu kỳ. Bản dùng trong sản phẩm giữ 10.505.065 dòng, đủ 86 pin và đủ các chu kỳ đã chọn; mọi điểm trong cửa sổ đầu xả được giữ nguyên. Giảm mật độ sau 120 giây giúp giảm dung lượng lưu trữ, không được coi là loại bỏ nhiễu.</w:t>
       </w:r>
     </w:p>
     <w:p>
@@ -360,7 +360,7 @@
     </w:p>
     <w:p>
       <w:r>
-        <w:t>Một dòng cảm biến chứa các số đo tại một thời điểm; một mẫu huấn luyện trong mô hình bảng đại diện cho một chu kỳ. Do đó, 10 triệu dòng không tương đương 10 triệu mẫu độc lập. Các điểm cùng chu kỳ có liên hệ theo thời gian, và các chu kỳ cùng pin cũng có liên hệ.</w:t>
+        <w:t>Một dòng cảm biến chứa các số đo tại một thời điểm; một mẫu huấn luyện trong mô hình bảng đại diện cho một chu kỳ. Do đó, 10.505.065 dòng không tương đương 10.505.065 mẫu độc lập. Các điểm cùng chu kỳ có liên hệ theo thời gian, và các chu kỳ cùng pin cũng có liên hệ.</w:t>
       </w:r>
     </w:p>
     <w:p>
@@ -541,22 +541,22 @@
         <w:pStyle w:val="Heading2"/>
       </w:pPr>
       <w:r>
-        <w:t>3.3. Tạo bản 10 triệu dòng</w:t>
+        <w:t>3.3. Tạo bản 10.505.065 dòng</w:t>
       </w:r>
     </w:p>
     <w:p>
       <w:r>
-        <w:t>Bản gọn giữ tất cả các chu kỳ đã chọn, mọi mẫu trong 120 giây đầu và điểm cuối mỗi chu kỳ. Ngân sách điểm còn lại được phân bổ theo số điểm của từng chu kỳ; các điểm phần giữa được chọn đều theo thứ tự thời gian. Từng dòng được giữ nguyên văn từ nguồn, không nhân bản, điền thiếu hay sửa số đo.</w:t>
+        <w:t>Bản gọn giữ tất cả các chu kỳ đã chọn, mọi mẫu trong 120 giây đầu và điểm cuối mỗi chu kỳ. Sau khi giữ các điểm bắt buộc, phần còn lại trong từng chu kỳ được sắp theo thời gian và giữ một trong ba điểm liên tiếp, bắt đầu từ điểm đầu của phần này. Không đặt trước tổng số dòng. Từng dòng được giữ nguyên văn từ nguồn, không nhân bản, điền thiếu hay sửa số đo.</w:t>
       </w:r>
     </w:p>
     <w:p>
       <w:r>
-        <w:t>Sau giảm mật độ, nguồn lưu 10.000.000 dòng trong 172 file CSV nén gzip. Dung lượng tham chiếu, nhãn và bảng đặc trưng được giữ từ bộ đủ điểm và được đối chiếu lại. Phần sau 120 giây mất chi tiết, nên bản này không thay thế dữ liệu đầy đủ cho nghiên cứu cần phân tích nguyên chuỗi hoặc tính ICA chính xác ở toàn bộ miền điện áp.</w:t>
+        <w:t>Sau giảm mật độ, nguồn lưu 10.505.065 dòng trong 172 file CSV nén gzip. Dung lượng tham chiếu, nhãn và bảng đặc trưng được giữ từ bộ đủ điểm và được đối chiếu lại. Phần sau 120 giây mất chi tiết, nên bản này không thay thế dữ liệu đầy đủ cho nghiên cứu cần phân tích nguyên chuỗi hoặc tính ICA chính xác ở toàn bộ miền điện áp.</w:t>
       </w:r>
     </w:p>
     <w:p>
       <w:r>
-        <w:t>Việc chọn đúng 10 triệu dòng phục vụ lưu trữ theo yêu cầu triển khai; đây không phải ngưỡng đảm bảo chất lượng học máy. Số pin độc lập và số chu kỳ hữu ích mới là thông tin cần báo cáo cùng số điểm cảm biến.</w:t>
+        <w:t>Số 10.505.065 là kết quả đếm sau khi áp dụng quy tắc lấy thưa, không phải số dòng được đặt trước. Đây không phải ngưỡng đảm bảo chất lượng học máy. Số pin độc lập và số chu kỳ hữu ích mới là thông tin cần báo cáo cùng số điểm cảm biến.</w:t>
       </w:r>
     </w:p>
     <w:p>
@@ -569,12 +569,12 @@
     </w:p>
     <w:p>
       <w:r>
-        <w:t>Bản xử lý được quét toàn bộ 10 triệu dòng. Không phát hiện giá trị thiếu/vô hạn ở tín hiệu bắt buộc hoặc khóa thời gian trùng. Nội dung dòng giải nén được kiểm SHA-256 theo file, đặc trưng được tính lại và nhãn được nối theo khóa pin/giai đoạn/chu kỳ.</w:t>
+        <w:t>Bản xử lý được quét toàn bộ 10.505.065 dòng. Không phát hiện giá trị thiếu/vô hạn ở tín hiệu bắt buộc hoặc khóa thời gian trùng. Nội dung dòng giải nén được kiểm SHA-256 theo file, đặc trưng được tính lại và nhãn được nối theo khóa pin/giai đoạn/chu kỳ.</w:t>
       </w:r>
     </w:p>
     <w:p>
       <w:r>
-        <w:t>Có 25 điểm nghi vấn biến thiên đột ngột còn nằm trong bộ chọn, không điểm nào thuộc 120 giây đầu. Đây là cờ kiểm tra theo quy tắc, chưa phải xác nhận lỗi cảm biến; các điểm không bị tự xóa hoặc sửa. Có 23 bước thời gian đi lùi trong thứ tự ghi nguồn. Bản sao phục vụ xử lý được sắp theo thời gian trong từng chu kỳ, còn file nguồn giữ nguyên.</w:t>
+        <w:t>Có 26 điểm nghi vấn biến thiên đột ngột còn nằm trong bộ chọn, không điểm nào thuộc 120 giây đầu. Đây là cờ kiểm tra theo quy tắc, chưa phải xác nhận lỗi cảm biến; các điểm không bị tự xóa hoặc sửa. Có 23 bước thời gian đi lùi trong thứ tự ghi nguồn. Bản sao phục vụ xử lý được sắp theo thời gian trong từng chu kỳ, còn file nguồn giữ nguyên.</w:t>
       </w:r>
     </w:p>
     <w:p>
@@ -1160,7 +1160,7 @@
     </w:p>
     <w:p>
       <w:r>
-        <w:t>Tập dùng trong sản phẩm có 10.000.000 dòng đo, 20.823 mẫu chu kỳ của 86 pin, gồm cả sử dụng ban đầu và tái sử dụng. Bảng dưới tổng hợp theo giai đoạn từ dữ liệu thực tế, không suy ra số chu kỳ bằng số dòng cảm biến.</w:t>
+        <w:t>Tập dùng trong sản phẩm có 10.505.065 dòng đo, 20.823 mẫu chu kỳ của 86 pin, gồm cả sử dụng ban đầu và tái sử dụng. Bảng dưới tổng hợp theo giai đoạn từ dữ liệu thực tế, không suy ra số chu kỳ bằng số dòng cảm biến.</w:t>
       </w:r>
     </w:p>
     <w:tbl>
@@ -4214,7 +4214,7 @@
     </w:p>
     <w:p>
       <w:r>
-        <w:t>Dự đoán nhận CSV cho một chu kỳ hoặc tối đa 100 nhóm trong một lần. Chương trình kiểm tra tên cột, tín hiệu hữu hạn, số chu kỳ và giai đoạn. Với lô dữ liệu, lỗi của một nhóm được báo riêng, không làm mất các kết quả hợp lệ khác. CSV mẫu có nhãn nguồn và không được trình bày như kiểm thử độc lập.</w:t>
+        <w:t>Dự đoán nhận CSV hoặc CSV.GZ tới 512 MiB cho một chu kỳ hoặc tối đa 2.000 nhóm trong một lần. Chương trình kiểm tra tên cột, tín hiệu hữu hạn, số chu kỳ và giai đoạn. Với lô dữ liệu, lỗi của một nhóm được báo riêng, không làm mất các kết quả hợp lệ khác. CSV mẫu có nhãn nguồn và không được trình bày như kiểm thử độc lập.</w:t>
       </w:r>
     </w:p>
     <w:p>
@@ -4299,7 +4299,7 @@
     </w:p>
     <w:p>
       <w:r>
-        <w:t>Lần kiểm thử lưu trong reports/pytest-results.xml gồm 44 trường hợp, 0 thất bại, 0 lỗi và 0 bỏ qua. Tệp dataset_check.json ghi kết quả kiểm tra toàn bộ 10 triệu dòng.</w:t>
+        <w:t>Lần kiểm thử lưu trong reports/pytest-results.xml gồm 47 trường hợp, 0 thất bại, 0 lỗi và 0 bỏ qua. Tệp dataset_check.json ghi kết quả kiểm tra toàn bộ 10.505.065 dòng.</w:t>
       </w:r>
     </w:p>
     <w:p>

</xml_diff>

<commit_message>
Vincent D: CSV/GZ dung lượng lớn, tiêu đề khóa luận và dữ liệu SDU lấy thưa theo quy tắc
</commit_message>
<xml_diff>
--- a/docs/bao-cao-khoa-luan.docx
+++ b/docs/bao-cao-khoa-luan.docx
@@ -211,7 +211,7 @@
     </w:p>
     <w:p>
       <w:r>
-        <w:t>Tôi sử dụng dữ liệu SDU do Wang, Gao và Tian công bố trên Zenodo năm 2025 [1]. Tập nguồn có 145.112.317 dòng đo của 86 tế bào pin, gồm sử dụng ban đầu và tái sử dụng. Sau nhận diện điều kiện xả tham chiếu, bộ được chọn có 30.929.675 dòng và 20.823 chu kỳ. Bản dùng trong sản phẩm giữ 10.000.000 dòng, đủ 86 pin và đủ các chu kỳ đã chọn; mọi điểm trong cửa sổ đầu xả được giữ nguyên. Giảm mật độ sau 120 giây giúp giảm dung lượng lưu trữ, không được coi là loại bỏ nhiễu.</w:t>
+        <w:t>Tôi sử dụng dữ liệu SDU do Wang, Gao và Tian công bố trên Zenodo năm 2025 [1]. Tập nguồn có 145.112.317 dòng đo của 86 tế bào pin, gồm sử dụng ban đầu và tái sử dụng. Sau nhận diện điều kiện xả tham chiếu, bộ được chọn có 30.929.675 dòng và 20.823 chu kỳ. Bản dùng trong sản phẩm giữ 10.505.065 dòng, đủ 86 pin và đủ các chu kỳ đã chọn; mọi điểm trong cửa sổ đầu xả được giữ nguyên. Giảm mật độ sau 120 giây giúp giảm dung lượng lưu trữ, không được coi là loại bỏ nhiễu.</w:t>
       </w:r>
     </w:p>
     <w:p>
@@ -360,7 +360,7 @@
     </w:p>
     <w:p>
       <w:r>
-        <w:t>Một dòng cảm biến chứa các số đo tại một thời điểm; một mẫu huấn luyện trong mô hình bảng đại diện cho một chu kỳ. Do đó, 10 triệu dòng không tương đương 10 triệu mẫu độc lập. Các điểm cùng chu kỳ có liên hệ theo thời gian, và các chu kỳ cùng pin cũng có liên hệ.</w:t>
+        <w:t>Một dòng cảm biến chứa các số đo tại một thời điểm; một mẫu huấn luyện trong mô hình bảng đại diện cho một chu kỳ. Do đó, 10.505.065 dòng không tương đương 10.505.065 mẫu độc lập. Các điểm cùng chu kỳ có liên hệ theo thời gian, và các chu kỳ cùng pin cũng có liên hệ.</w:t>
       </w:r>
     </w:p>
     <w:p>
@@ -541,22 +541,22 @@
         <w:pStyle w:val="Heading2"/>
       </w:pPr>
       <w:r>
-        <w:t>3.3. Tạo bản 10 triệu dòng</w:t>
+        <w:t>3.3. Tạo bản 10.505.065 dòng</w:t>
       </w:r>
     </w:p>
     <w:p>
       <w:r>
-        <w:t>Bản gọn giữ tất cả các chu kỳ đã chọn, mọi mẫu trong 120 giây đầu và điểm cuối mỗi chu kỳ. Ngân sách điểm còn lại được phân bổ theo số điểm của từng chu kỳ; các điểm phần giữa được chọn đều theo thứ tự thời gian. Từng dòng được giữ nguyên văn từ nguồn, không nhân bản, điền thiếu hay sửa số đo.</w:t>
+        <w:t>Bản gọn giữ tất cả các chu kỳ đã chọn, mọi mẫu trong 120 giây đầu và điểm cuối mỗi chu kỳ. Sau khi giữ các điểm bắt buộc, phần còn lại trong từng chu kỳ được sắp theo thời gian và giữ một trong ba điểm liên tiếp, bắt đầu từ điểm đầu của phần này. Không đặt trước tổng số dòng. Từng dòng được giữ nguyên văn từ nguồn, không nhân bản, điền thiếu hay sửa số đo.</w:t>
       </w:r>
     </w:p>
     <w:p>
       <w:r>
-        <w:t>Sau giảm mật độ, nguồn lưu 10.000.000 dòng trong 172 file CSV nén gzip. Dung lượng tham chiếu, nhãn và bảng đặc trưng được giữ từ bộ đủ điểm và được đối chiếu lại. Phần sau 120 giây mất chi tiết, nên bản này không thay thế dữ liệu đầy đủ cho nghiên cứu cần phân tích nguyên chuỗi hoặc tính ICA chính xác ở toàn bộ miền điện áp.</w:t>
+        <w:t>Sau giảm mật độ, nguồn lưu 10.505.065 dòng trong 172 file CSV nén gzip. Dung lượng tham chiếu, nhãn và bảng đặc trưng được giữ từ bộ đủ điểm và được đối chiếu lại. Phần sau 120 giây mất chi tiết, nên bản này không thay thế dữ liệu đầy đủ cho nghiên cứu cần phân tích nguyên chuỗi hoặc tính ICA chính xác ở toàn bộ miền điện áp.</w:t>
       </w:r>
     </w:p>
     <w:p>
       <w:r>
-        <w:t>Việc chọn đúng 10 triệu dòng phục vụ lưu trữ theo yêu cầu triển khai; đây không phải ngưỡng đảm bảo chất lượng học máy. Số pin độc lập và số chu kỳ hữu ích mới là thông tin cần báo cáo cùng số điểm cảm biến.</w:t>
+        <w:t>Số 10.505.065 là kết quả đếm sau khi áp dụng quy tắc lấy thưa, không phải số dòng được đặt trước. Đây không phải ngưỡng đảm bảo chất lượng học máy. Số pin độc lập và số chu kỳ hữu ích mới là thông tin cần báo cáo cùng số điểm cảm biến.</w:t>
       </w:r>
     </w:p>
     <w:p>
@@ -569,12 +569,12 @@
     </w:p>
     <w:p>
       <w:r>
-        <w:t>Bản xử lý được quét toàn bộ 10 triệu dòng. Không phát hiện giá trị thiếu/vô hạn ở tín hiệu bắt buộc hoặc khóa thời gian trùng. Nội dung dòng giải nén được kiểm SHA-256 theo file, đặc trưng được tính lại và nhãn được nối theo khóa pin/giai đoạn/chu kỳ.</w:t>
+        <w:t>Bản xử lý được quét toàn bộ 10.505.065 dòng. Không phát hiện giá trị thiếu/vô hạn ở tín hiệu bắt buộc hoặc khóa thời gian trùng. Nội dung dòng giải nén được kiểm SHA-256 theo file, đặc trưng được tính lại và nhãn được nối theo khóa pin/giai đoạn/chu kỳ.</w:t>
       </w:r>
     </w:p>
     <w:p>
       <w:r>
-        <w:t>Có 25 điểm nghi vấn biến thiên đột ngột còn nằm trong bộ chọn, không điểm nào thuộc 120 giây đầu. Đây là cờ kiểm tra theo quy tắc, chưa phải xác nhận lỗi cảm biến; các điểm không bị tự xóa hoặc sửa. Có 23 bước thời gian đi lùi trong thứ tự ghi nguồn. Bản sao phục vụ xử lý được sắp theo thời gian trong từng chu kỳ, còn file nguồn giữ nguyên.</w:t>
+        <w:t>Có 26 điểm nghi vấn biến thiên đột ngột còn nằm trong bộ chọn, không điểm nào thuộc 120 giây đầu. Đây là cờ kiểm tra theo quy tắc, chưa phải xác nhận lỗi cảm biến; các điểm không bị tự xóa hoặc sửa. Có 23 bước thời gian đi lùi trong thứ tự ghi nguồn. Bản sao phục vụ xử lý được sắp theo thời gian trong từng chu kỳ, còn file nguồn giữ nguyên.</w:t>
       </w:r>
     </w:p>
     <w:p>
@@ -1160,7 +1160,7 @@
     </w:p>
     <w:p>
       <w:r>
-        <w:t>Tập dùng trong sản phẩm có 10.000.000 dòng đo, 20.823 mẫu chu kỳ của 86 pin, gồm cả sử dụng ban đầu và tái sử dụng. Bảng dưới tổng hợp theo giai đoạn từ dữ liệu thực tế, không suy ra số chu kỳ bằng số dòng cảm biến.</w:t>
+        <w:t>Tập dùng trong sản phẩm có 10.505.065 dòng đo, 20.823 mẫu chu kỳ của 86 pin, gồm cả sử dụng ban đầu và tái sử dụng. Bảng dưới tổng hợp theo giai đoạn từ dữ liệu thực tế, không suy ra số chu kỳ bằng số dòng cảm biến.</w:t>
       </w:r>
     </w:p>
     <w:tbl>
@@ -4214,7 +4214,7 @@
     </w:p>
     <w:p>
       <w:r>
-        <w:t>Dự đoán nhận CSV cho một chu kỳ hoặc tối đa 100 nhóm trong một lần. Chương trình kiểm tra tên cột, tín hiệu hữu hạn, số chu kỳ và giai đoạn. Với lô dữ liệu, lỗi của một nhóm được báo riêng, không làm mất các kết quả hợp lệ khác. CSV mẫu có nhãn nguồn và không được trình bày như kiểm thử độc lập.</w:t>
+        <w:t>Dự đoán nhận CSV hoặc CSV.GZ tới 512 MiB cho một chu kỳ hoặc tối đa 2.000 nhóm trong một lần. Chương trình kiểm tra tên cột, tín hiệu hữu hạn, số chu kỳ và giai đoạn. Với lô dữ liệu, lỗi của một nhóm được báo riêng, không làm mất các kết quả hợp lệ khác. CSV mẫu có nhãn nguồn và không được trình bày như kiểm thử độc lập.</w:t>
       </w:r>
     </w:p>
     <w:p>
@@ -4299,7 +4299,7 @@
     </w:p>
     <w:p>
       <w:r>
-        <w:t>Lần kiểm thử lưu trong reports/pytest-results.xml gồm 44 trường hợp, 0 thất bại, 0 lỗi và 0 bỏ qua. Tệp dataset_check.json ghi kết quả kiểm tra toàn bộ 10 triệu dòng.</w:t>
+        <w:t>Lần kiểm thử lưu trong reports/pytest-results.xml gồm 47 trường hợp, 0 thất bại, 0 lỗi và 0 bỏ qua. Tệp dataset_check.json ghi kết quả kiểm tra toàn bộ 10.505.065 dòng.</w:t>
       </w:r>
     </w:p>
     <w:p>

</xml_diff>

<commit_message>
Ước lượng SOH bằng Ridge–RF phần dư và giám sát xu hướng pin
Phương án kết hợp dùng cùng nhóm pin, so sánh cặp theo pin; không tuyên bố thuật toán mới. Isolation Forest và nền quá khứ đánh dấu chu kỳ cần xem xét, chưa có nhãn lỗi hoặc kiểm chứng BMS. 58 kiểm thử đạt, báo cáo và notebook đồng bộ.
</commit_message>
<xml_diff>
--- a/docs/bao-cao-khoa-luan.docx
+++ b/docs/bao-cao-khoa-luan.docx
@@ -162,32 +162,32 @@
     </w:p>
     <w:p>
       <w:r>
-        <w:t>Chương 5. Xây dựng sản phẩm Vincent D  ·  19</w:t>
+        <w:t>Chương 5. Xây dựng sản phẩm Vincent D  ·  21</w:t>
       </w:r>
     </w:p>
     <w:p>
       <w:r>
-        <w:t>Kết luận  ·  22</w:t>
+        <w:t>Kết luận  ·  24</w:t>
       </w:r>
     </w:p>
     <w:p>
       <w:r>
-        <w:t>Tài liệu tham khảo  ·  23</w:t>
+        <w:t>Tài liệu tham khảo  ·  25</w:t>
       </w:r>
     </w:p>
     <w:p>
       <w:r>
-        <w:t>Phụ lục A. Kết quả Random Forest theo pin  ·  24</w:t>
+        <w:t>Phụ lục A. Kết quả Random Forest theo pin  ·  26</w:t>
       </w:r>
     </w:p>
     <w:p>
       <w:r>
-        <w:t>Phụ lục B. Cấu trúc mã nguồn  ·  27</w:t>
+        <w:t>Phụ lục B. Cấu trúc mã nguồn  ·  29</w:t>
       </w:r>
     </w:p>
     <w:p>
       <w:r>
-        <w:t>Phụ lục C. Cấu hình thực nghiệm  ·  28</w:t>
+        <w:t>Phụ lục C. Cấu hình thực nghiệm  ·  30</w:t>
       </w:r>
     </w:p>
     <w:p>
@@ -4174,6 +4174,563 @@
     </w:p>
     <w:p>
       <w:pPr>
+        <w:pStyle w:val="Heading2"/>
+      </w:pPr>
+      <w:r>
+        <w:t>4.9. Giám sát xu hướng SOH bất thường</w:t>
+      </w:r>
+    </w:p>
+    <w:p>
+      <w:r>
+        <w:t>Phần bổ sung giám sát SOH tham chiếu đã quan sát theo từng pin và giai đoạn. Nền dự kiến dùng tốc độ biến thiên trung vị của tối đa 8 khoảng quá khứ, ít nhất 5 khoảng. Tốc độ tính theo chênh lệch số chu kỳ thực, không coi các mẫu xả tham chiếu là những chu kỳ liên tiếp. Độ lệch chuẩn hóa dùng MAD quá khứ với sàn thang đo 0,01 điểm phần trăm SOH mỗi chu kỳ. Quy tắc gắn cờ yêu cầu độ lệch chuẩn hóa trên 4,5 và sai lệch tuyệt đối ít nhất 1 điểm phần trăm SOH.</w:t>
+      </w:r>
+    </w:p>
+    <w:p>
+      <w:r>
+        <w:t>Isolation Forest [8] dùng 150 cây, max_samples 256 và seed 42. Đặc trưng là tốc độ hiện tại, tốc độ nền quá khứ, sai lệch SOH và độ lệch chuẩn hóa. Cùng phân hoạch 5 vòng theo pin; ngưỡng là phân vị 99% điểm các pin học của từng vòng. Không chọn ngưỡng bằng tập kiểm thử. Dữ liệu học chưa có nhãn lỗi, nên cách làm giả định đa số diễn biến là thông thường, không chứng minh tập học hoàn toàn bình thường.</w:t>
+      </w:r>
+    </w:p>
+    <w:p>
+      <w:r>
+        <w:t>Kết hợp hai phương pháp theo phép hoặc cho 74 cờ trong 12.145 mẫu đủ lịch sử giai đoạn đầu và 135 cờ trong 7.646 mẫu đủ lịch sử tái sử dụng, tương ứng khoảng 0,61% và 1,77%. Cờ chu kỳ SOH khác các điểm nghi vấn tín hiệu điện áp/nhiệt độ ở phần kiểm tra dữ liệu, không cộng chung hai số đếm. Số cờ không phải số lỗi xác nhận hoặc độ chính xác. Chưa có nhãn lỗi nên không báo cáo precision, recall hay mức cải thiện phát hiện lỗi thực tế. Các điểm không bị tự sửa hoặc xóa.</w:t>
+      </w:r>
+    </w:p>
+    <w:p>
+      <w:r>
+        <w:t>Thiết kế dùng các quan sát SOH quá khứ của chính pin đang giám sát, nhưng không dùng tương lai để tạo nền. SOH tham chiếu cần phép đo dung lượng; kết quả không đồng nghĩa cảnh báo BMS trực tuyến hoặc chứng nhận pin nguy hiểm. Chưa có dữ liệu BMS trên xe, nên chưa thực hiện kiểm chứng thực tế. Kế hoạch và dữ liệu cần có được ghi riêng trong docs/kiem-chung-bms.md.</w:t>
+      </w:r>
+    </w:p>
+    <w:p>
+      <w:pPr>
+        <w:pStyle w:val="Heading2"/>
+      </w:pPr>
+      <w:r>
+        <w:t>4.10. Phương án khóa luận: Ridge–RF hiệu chỉnh phần dư</w:t>
+      </w:r>
+    </w:p>
+    <w:p>
+      <w:r>
+        <w:t>Tôi kiểm chứng cách kết hợp hai thuật toán có sẵn [3,4]: Ridge học xu hướng nền; Random Forest học phần dư r_train = y_train − Ridge(X_train). Kết quả cuối là SOH_dự_đoán = Ridge(X) + RF_phần_dư(X). Chỉ tập train được dùng để học bộ chuẩn hóa, hệ số Ridge và cây phần dư. Không dùng nhãn pin kiểm thử để hiệu chỉnh. Bảng đầu vào giữ đúng 12 đặc trưng, cùng 5 nhóm pin và seed 42; cấu hình được cố định, không tối ưu theo các điểm test.</w:t>
+      </w:r>
+    </w:p>
+    <w:tbl>
+      <w:tblPr>
+        <w:tblStyle w:val="TableGrid"/>
+        <w:tblW w:type="auto" w:w="0"/>
+        <w:tblLook w:firstColumn="1" w:firstRow="1" w:lastColumn="0" w:lastRow="0" w:noHBand="0" w:noVBand="1" w:val="04A0"/>
+      </w:tblPr>
+      <w:tblGrid>
+        <w:gridCol w:w="2197"/>
+        <w:gridCol w:w="2197"/>
+        <w:gridCol w:w="2197"/>
+        <w:gridCol w:w="2197"/>
+      </w:tblGrid>
+      <w:tr>
+        <w:trPr>
+          <w:tblHeader/>
+        </w:trPr>
+        <w:tc>
+          <w:tcPr>
+            <w:tcW w:type="dxa" w:w="2197"/>
+          </w:tcPr>
+          <w:p>
+            <w:pPr>
+              <w:spacing w:line="264" w:lineRule="auto"/>
+            </w:pPr>
+            <w:r>
+              <w:rPr>
+                <w:b/>
+                <w:sz w:val="18"/>
+              </w:rPr>
+              <w:t>Mô hình</w:t>
+            </w:r>
+          </w:p>
+        </w:tc>
+        <w:tc>
+          <w:tcPr>
+            <w:tcW w:type="dxa" w:w="2197"/>
+          </w:tcPr>
+          <w:p>
+            <w:pPr>
+              <w:spacing w:line="264" w:lineRule="auto"/>
+            </w:pPr>
+            <w:r>
+              <w:rPr>
+                <w:b/>
+                <w:sz w:val="18"/>
+              </w:rPr>
+              <w:t>MAE (điểm % SOH)</w:t>
+            </w:r>
+          </w:p>
+        </w:tc>
+        <w:tc>
+          <w:tcPr>
+            <w:tcW w:type="dxa" w:w="2197"/>
+          </w:tcPr>
+          <w:p>
+            <w:pPr>
+              <w:spacing w:line="264" w:lineRule="auto"/>
+            </w:pPr>
+            <w:r>
+              <w:rPr>
+                <w:b/>
+                <w:sz w:val="18"/>
+              </w:rPr>
+              <w:t>RMSE (điểm % SOH)</w:t>
+            </w:r>
+          </w:p>
+        </w:tc>
+        <w:tc>
+          <w:tcPr>
+            <w:tcW w:type="dxa" w:w="2197"/>
+          </w:tcPr>
+          <w:p>
+            <w:pPr>
+              <w:spacing w:line="264" w:lineRule="auto"/>
+            </w:pPr>
+            <w:r>
+              <w:rPr>
+                <w:b/>
+                <w:sz w:val="18"/>
+              </w:rPr>
+              <w:t>R²</w:t>
+            </w:r>
+          </w:p>
+        </w:tc>
+      </w:tr>
+      <w:tr>
+        <w:tc>
+          <w:tcPr>
+            <w:tcW w:type="dxa" w:w="2197"/>
+          </w:tcPr>
+          <w:p>
+            <w:pPr>
+              <w:spacing w:line="264" w:lineRule="auto"/>
+            </w:pPr>
+            <w:r>
+              <w:rPr>
+                <w:b w:val="0"/>
+                <w:sz w:val="18"/>
+              </w:rPr>
+              <w:t>Trung bình SOH — mốc cơ sở</w:t>
+            </w:r>
+          </w:p>
+        </w:tc>
+        <w:tc>
+          <w:tcPr>
+            <w:tcW w:type="dxa" w:w="2197"/>
+          </w:tcPr>
+          <w:p>
+            <w:pPr>
+              <w:spacing w:line="264" w:lineRule="auto"/>
+            </w:pPr>
+            <w:r>
+              <w:rPr>
+                <w:b w:val="0"/>
+                <w:sz w:val="18"/>
+              </w:rPr>
+              <w:t>13.246</w:t>
+            </w:r>
+          </w:p>
+        </w:tc>
+        <w:tc>
+          <w:tcPr>
+            <w:tcW w:type="dxa" w:w="2197"/>
+          </w:tcPr>
+          <w:p>
+            <w:pPr>
+              <w:spacing w:line="264" w:lineRule="auto"/>
+            </w:pPr>
+            <w:r>
+              <w:rPr>
+                <w:b w:val="0"/>
+                <w:sz w:val="18"/>
+              </w:rPr>
+              <w:t>15.249</w:t>
+            </w:r>
+          </w:p>
+        </w:tc>
+        <w:tc>
+          <w:tcPr>
+            <w:tcW w:type="dxa" w:w="2197"/>
+          </w:tcPr>
+          <w:p>
+            <w:pPr>
+              <w:spacing w:line="264" w:lineRule="auto"/>
+            </w:pPr>
+            <w:r>
+              <w:rPr>
+                <w:b w:val="0"/>
+                <w:sz w:val="18"/>
+              </w:rPr>
+              <w:t>-0.281</w:t>
+            </w:r>
+          </w:p>
+        </w:tc>
+      </w:tr>
+      <w:tr>
+        <w:tc>
+          <w:tcPr>
+            <w:tcW w:type="dxa" w:w="2197"/>
+          </w:tcPr>
+          <w:p>
+            <w:pPr>
+              <w:spacing w:line="264" w:lineRule="auto"/>
+            </w:pPr>
+            <w:r>
+              <w:rPr>
+                <w:b w:val="0"/>
+                <w:sz w:val="18"/>
+              </w:rPr>
+              <w:t>Hồi quy Ridge</w:t>
+            </w:r>
+          </w:p>
+        </w:tc>
+        <w:tc>
+          <w:tcPr>
+            <w:tcW w:type="dxa" w:w="2197"/>
+          </w:tcPr>
+          <w:p>
+            <w:pPr>
+              <w:spacing w:line="264" w:lineRule="auto"/>
+            </w:pPr>
+            <w:r>
+              <w:rPr>
+                <w:b w:val="0"/>
+                <w:sz w:val="18"/>
+              </w:rPr>
+              <w:t>2.582</w:t>
+            </w:r>
+          </w:p>
+        </w:tc>
+        <w:tc>
+          <w:tcPr>
+            <w:tcW w:type="dxa" w:w="2197"/>
+          </w:tcPr>
+          <w:p>
+            <w:pPr>
+              <w:spacing w:line="264" w:lineRule="auto"/>
+            </w:pPr>
+            <w:r>
+              <w:rPr>
+                <w:b w:val="0"/>
+                <w:sz w:val="18"/>
+              </w:rPr>
+              <w:t>3.299</w:t>
+            </w:r>
+          </w:p>
+        </w:tc>
+        <w:tc>
+          <w:tcPr>
+            <w:tcW w:type="dxa" w:w="2197"/>
+          </w:tcPr>
+          <w:p>
+            <w:pPr>
+              <w:spacing w:line="264" w:lineRule="auto"/>
+            </w:pPr>
+            <w:r>
+              <w:rPr>
+                <w:b w:val="0"/>
+                <w:sz w:val="18"/>
+              </w:rPr>
+              <w:t>0.933</w:t>
+            </w:r>
+          </w:p>
+        </w:tc>
+      </w:tr>
+      <w:tr>
+        <w:tc>
+          <w:tcPr>
+            <w:tcW w:type="dxa" w:w="2197"/>
+          </w:tcPr>
+          <w:p>
+            <w:pPr>
+              <w:spacing w:line="264" w:lineRule="auto"/>
+            </w:pPr>
+            <w:r>
+              <w:rPr>
+                <w:b w:val="0"/>
+                <w:sz w:val="18"/>
+              </w:rPr>
+              <w:t>Rừng ngẫu nhiên — Random Forest</w:t>
+            </w:r>
+          </w:p>
+        </w:tc>
+        <w:tc>
+          <w:tcPr>
+            <w:tcW w:type="dxa" w:w="2197"/>
+          </w:tcPr>
+          <w:p>
+            <w:pPr>
+              <w:spacing w:line="264" w:lineRule="auto"/>
+            </w:pPr>
+            <w:r>
+              <w:rPr>
+                <w:b w:val="0"/>
+                <w:sz w:val="18"/>
+              </w:rPr>
+              <w:t>1.619</w:t>
+            </w:r>
+          </w:p>
+        </w:tc>
+        <w:tc>
+          <w:tcPr>
+            <w:tcW w:type="dxa" w:w="2197"/>
+          </w:tcPr>
+          <w:p>
+            <w:pPr>
+              <w:spacing w:line="264" w:lineRule="auto"/>
+            </w:pPr>
+            <w:r>
+              <w:rPr>
+                <w:b w:val="0"/>
+                <w:sz w:val="18"/>
+              </w:rPr>
+              <w:t>2.157</w:t>
+            </w:r>
+          </w:p>
+        </w:tc>
+        <w:tc>
+          <w:tcPr>
+            <w:tcW w:type="dxa" w:w="2197"/>
+          </w:tcPr>
+          <w:p>
+            <w:pPr>
+              <w:spacing w:line="264" w:lineRule="auto"/>
+            </w:pPr>
+            <w:r>
+              <w:rPr>
+                <w:b w:val="0"/>
+                <w:sz w:val="18"/>
+              </w:rPr>
+              <w:t>0.970</w:t>
+            </w:r>
+          </w:p>
+        </w:tc>
+      </w:tr>
+      <w:tr>
+        <w:tc>
+          <w:tcPr>
+            <w:tcW w:type="dxa" w:w="2197"/>
+          </w:tcPr>
+          <w:p>
+            <w:pPr>
+              <w:spacing w:line="264" w:lineRule="auto"/>
+            </w:pPr>
+            <w:r>
+              <w:rPr>
+                <w:b w:val="0"/>
+                <w:sz w:val="18"/>
+              </w:rPr>
+              <w:t>Tăng cường cây — LightGBM</w:t>
+            </w:r>
+          </w:p>
+        </w:tc>
+        <w:tc>
+          <w:tcPr>
+            <w:tcW w:type="dxa" w:w="2197"/>
+          </w:tcPr>
+          <w:p>
+            <w:pPr>
+              <w:spacing w:line="264" w:lineRule="auto"/>
+            </w:pPr>
+            <w:r>
+              <w:rPr>
+                <w:b w:val="0"/>
+                <w:sz w:val="18"/>
+              </w:rPr>
+              <w:t>1.734</w:t>
+            </w:r>
+          </w:p>
+        </w:tc>
+        <w:tc>
+          <w:tcPr>
+            <w:tcW w:type="dxa" w:w="2197"/>
+          </w:tcPr>
+          <w:p>
+            <w:pPr>
+              <w:spacing w:line="264" w:lineRule="auto"/>
+            </w:pPr>
+            <w:r>
+              <w:rPr>
+                <w:b w:val="0"/>
+                <w:sz w:val="18"/>
+              </w:rPr>
+              <w:t>2.270</w:t>
+            </w:r>
+          </w:p>
+        </w:tc>
+        <w:tc>
+          <w:tcPr>
+            <w:tcW w:type="dxa" w:w="2197"/>
+          </w:tcPr>
+          <w:p>
+            <w:pPr>
+              <w:spacing w:line="264" w:lineRule="auto"/>
+            </w:pPr>
+            <w:r>
+              <w:rPr>
+                <w:b w:val="0"/>
+                <w:sz w:val="18"/>
+              </w:rPr>
+              <w:t>0.968</w:t>
+            </w:r>
+          </w:p>
+        </w:tc>
+      </w:tr>
+      <w:tr>
+        <w:tc>
+          <w:tcPr>
+            <w:tcW w:type="dxa" w:w="2197"/>
+          </w:tcPr>
+          <w:p>
+            <w:pPr>
+              <w:spacing w:line="264" w:lineRule="auto"/>
+            </w:pPr>
+            <w:r>
+              <w:rPr>
+                <w:b w:val="0"/>
+                <w:sz w:val="18"/>
+              </w:rPr>
+              <w:t>Mạng chuỗi thời gian — GRU</w:t>
+            </w:r>
+          </w:p>
+        </w:tc>
+        <w:tc>
+          <w:tcPr>
+            <w:tcW w:type="dxa" w:w="2197"/>
+          </w:tcPr>
+          <w:p>
+            <w:pPr>
+              <w:spacing w:line="264" w:lineRule="auto"/>
+            </w:pPr>
+            <w:r>
+              <w:rPr>
+                <w:b w:val="0"/>
+                <w:sz w:val="18"/>
+              </w:rPr>
+              <w:t>2.141</w:t>
+            </w:r>
+          </w:p>
+        </w:tc>
+        <w:tc>
+          <w:tcPr>
+            <w:tcW w:type="dxa" w:w="2197"/>
+          </w:tcPr>
+          <w:p>
+            <w:pPr>
+              <w:spacing w:line="264" w:lineRule="auto"/>
+            </w:pPr>
+            <w:r>
+              <w:rPr>
+                <w:b w:val="0"/>
+                <w:sz w:val="18"/>
+              </w:rPr>
+              <w:t>2.718</w:t>
+            </w:r>
+          </w:p>
+        </w:tc>
+        <w:tc>
+          <w:tcPr>
+            <w:tcW w:type="dxa" w:w="2197"/>
+          </w:tcPr>
+          <w:p>
+            <w:pPr>
+              <w:spacing w:line="264" w:lineRule="auto"/>
+            </w:pPr>
+            <w:r>
+              <w:rPr>
+                <w:b w:val="0"/>
+                <w:sz w:val="18"/>
+              </w:rPr>
+              <w:t>0.953</w:t>
+            </w:r>
+          </w:p>
+        </w:tc>
+      </w:tr>
+      <w:tr>
+        <w:tc>
+          <w:tcPr>
+            <w:tcW w:type="dxa" w:w="2197"/>
+          </w:tcPr>
+          <w:p>
+            <w:pPr>
+              <w:spacing w:line="264" w:lineRule="auto"/>
+            </w:pPr>
+            <w:r>
+              <w:rPr>
+                <w:b w:val="0"/>
+                <w:sz w:val="18"/>
+              </w:rPr>
+              <w:t>Ridge–RF hiệu chỉnh phần dư</w:t>
+            </w:r>
+          </w:p>
+        </w:tc>
+        <w:tc>
+          <w:tcPr>
+            <w:tcW w:type="dxa" w:w="2197"/>
+          </w:tcPr>
+          <w:p>
+            <w:pPr>
+              <w:spacing w:line="264" w:lineRule="auto"/>
+            </w:pPr>
+            <w:r>
+              <w:rPr>
+                <w:b w:val="0"/>
+                <w:sz w:val="18"/>
+              </w:rPr>
+              <w:t>1.612</w:t>
+            </w:r>
+          </w:p>
+        </w:tc>
+        <w:tc>
+          <w:tcPr>
+            <w:tcW w:type="dxa" w:w="2197"/>
+          </w:tcPr>
+          <w:p>
+            <w:pPr>
+              <w:spacing w:line="264" w:lineRule="auto"/>
+            </w:pPr>
+            <w:r>
+              <w:rPr>
+                <w:b w:val="0"/>
+                <w:sz w:val="18"/>
+              </w:rPr>
+              <w:t>2.160</w:t>
+            </w:r>
+          </w:p>
+        </w:tc>
+        <w:tc>
+          <w:tcPr>
+            <w:tcW w:type="dxa" w:w="2197"/>
+          </w:tcPr>
+          <w:p>
+            <w:pPr>
+              <w:spacing w:line="264" w:lineRule="auto"/>
+            </w:pPr>
+            <w:r>
+              <w:rPr>
+                <w:b w:val="0"/>
+                <w:sz w:val="18"/>
+              </w:rPr>
+              <w:t>0.971</w:t>
+            </w:r>
+          </w:p>
+        </w:tc>
+      </w:tr>
+    </w:tbl>
+    <w:p>
+      <w:r>
+        <w:t>Phương án phần dư đạt MAE khoảng 1,612 điểm phần trăm SOH so với 1,619 của RF; RMSE khoảng 2,160 so với 2,157. Cải thiện MAE nhỏ và RMSE hơi tăng, chưa chứng minh ưu thế rõ ràng. Kết quả theo từng pin, cả trường hợp tăng và giảm sai số, được giữ trong reports/hybrid_paired_comparison.csv. Chưa khảo sát nhiều seed hoặc bộ dữ liệu độc lập nên không khẳng định cải tiến có ý nghĩa thống kê hoặc tổng quát.</w:t>
+      </w:r>
+    </w:p>
+    <w:p>
+      <w:r>
+        <w:t>Đây là phương án kết hợp được triển khai và đánh giá trong khóa luận, không tuyên bố là thuật toán hoàn toàn mới hoặc công bố đầu tiên. Mô hình học lại toàn bộ được lưu riêng và có thể chọn trên trang dự đoán; kết quả này tách khỏi các dự đoán giữ riêng dùng đánh giá. Random Forest vẫn là lựa chọn mặc định của ứng dụng, không dùng chênh lệch nhỏ trên test để tuyên bố đổi mô hình tốt nhất.</w:t>
+      </w:r>
+    </w:p>
+    <w:p>
+      <w:pPr>
         <w:pStyle w:val="Heading1"/>
         <w:pageBreakBefore/>
       </w:pPr>
@@ -4219,7 +4776,7 @@
     </w:p>
     <w:p>
       <w:r>
-        <w:t>Lịch sử chỉ lưu trong phiên làm việc, không phải cơ sở dữ liệu người dùng. Phiếu kết quả có thể tải dưới dạng CSV và HTML. Trang chất lượng trình bày nguồn, tiến trình chọn dữ liệu và các điểm nghi vấn. Trang thông tin cung cấp trích dẫn và tài liệu nghiên cứu.</w:t>
+        <w:t>Lịch sử chỉ lưu trong phiên làm việc, không phải cơ sở dữ liệu người dùng. Phiếu kết quả có thể tải dưới dạng CSV và HTML. Trang Xu hướng bất thường hiển thị chuỗi SOH, nền quá khứ, cờ của quy tắc/Isolation Forest và lý do; dữ liệu có thể xuất CSV. Trang chất lượng trình bày nguồn, tiến trình chọn dữ liệu và các điểm nghi vấn. Trang thông tin cung cấp trích dẫn và tài liệu nghiên cứu.</w:t>
       </w:r>
     </w:p>
     <w:p>
@@ -4299,7 +4856,7 @@
     </w:p>
     <w:p>
       <w:r>
-        <w:t>Lần kiểm thử lưu trong reports/pytest-results.xml gồm 47 trường hợp, 0 thất bại, 0 lỗi và 0 bỏ qua. Tệp dataset_check.json ghi kết quả kiểm tra toàn bộ 10.505.065 dòng.</w:t>
+        <w:t>Lần kiểm thử lưu trong reports/pytest-results.xml gồm 58 trường hợp, 0 thất bại, 0 lỗi và 0 bỏ qua. Tệp dataset_check.json ghi kết quả kiểm tra toàn bộ 10.505.065 dòng.</w:t>
       </w:r>
     </w:p>
     <w:p>
@@ -4386,6 +4943,11 @@
     <w:p>
       <w:r>
         <w:t>[7] Pedregosa, F., et al. (2011). Scikit-learn: Machine Learning in Python. Journal of Machine Learning Research, 12, 2825–2830. https://jmlr.org/papers/v12/pedregosa11a.html.</w:t>
+      </w:r>
+    </w:p>
+    <w:p>
+      <w:r>
+        <w:t>[8] Liu, F. T., Ting, K. M., &amp; Zhou, Z.-H. (2008). Isolation Forest. IEEE ICDM, 413–422. https://doi.org/10.1109/ICDM.2008.17.</w:t>
       </w:r>
     </w:p>
     <w:p>

</xml_diff>

<commit_message>
Vincent D: phương án Ridge–RF phần dư, giám sát xu hướng và demo kiểm thử
</commit_message>
<xml_diff>
--- a/docs/bao-cao-khoa-luan.docx
+++ b/docs/bao-cao-khoa-luan.docx
@@ -162,32 +162,32 @@
     </w:p>
     <w:p>
       <w:r>
-        <w:t>Chương 5. Xây dựng sản phẩm Vincent D  ·  19</w:t>
+        <w:t>Chương 5. Xây dựng sản phẩm Vincent D  ·  21</w:t>
       </w:r>
     </w:p>
     <w:p>
       <w:r>
-        <w:t>Kết luận  ·  22</w:t>
+        <w:t>Kết luận  ·  24</w:t>
       </w:r>
     </w:p>
     <w:p>
       <w:r>
-        <w:t>Tài liệu tham khảo  ·  23</w:t>
+        <w:t>Tài liệu tham khảo  ·  25</w:t>
       </w:r>
     </w:p>
     <w:p>
       <w:r>
-        <w:t>Phụ lục A. Kết quả Random Forest theo pin  ·  24</w:t>
+        <w:t>Phụ lục A. Kết quả Random Forest theo pin  ·  26</w:t>
       </w:r>
     </w:p>
     <w:p>
       <w:r>
-        <w:t>Phụ lục B. Cấu trúc mã nguồn  ·  27</w:t>
+        <w:t>Phụ lục B. Cấu trúc mã nguồn  ·  29</w:t>
       </w:r>
     </w:p>
     <w:p>
       <w:r>
-        <w:t>Phụ lục C. Cấu hình thực nghiệm  ·  28</w:t>
+        <w:t>Phụ lục C. Cấu hình thực nghiệm  ·  30</w:t>
       </w:r>
     </w:p>
     <w:p>
@@ -4174,6 +4174,563 @@
     </w:p>
     <w:p>
       <w:pPr>
+        <w:pStyle w:val="Heading2"/>
+      </w:pPr>
+      <w:r>
+        <w:t>4.9. Giám sát xu hướng SOH bất thường</w:t>
+      </w:r>
+    </w:p>
+    <w:p>
+      <w:r>
+        <w:t>Phần bổ sung giám sát SOH tham chiếu đã quan sát theo từng pin và giai đoạn. Nền dự kiến dùng tốc độ biến thiên trung vị của tối đa 8 khoảng quá khứ, ít nhất 5 khoảng. Tốc độ tính theo chênh lệch số chu kỳ thực, không coi các mẫu xả tham chiếu là những chu kỳ liên tiếp. Độ lệch chuẩn hóa dùng MAD quá khứ với sàn thang đo 0,01 điểm phần trăm SOH mỗi chu kỳ. Quy tắc gắn cờ yêu cầu độ lệch chuẩn hóa trên 4,5 và sai lệch tuyệt đối ít nhất 1 điểm phần trăm SOH.</w:t>
+      </w:r>
+    </w:p>
+    <w:p>
+      <w:r>
+        <w:t>Isolation Forest [8] dùng 150 cây, max_samples 256 và seed 42. Đặc trưng là tốc độ hiện tại, tốc độ nền quá khứ, sai lệch SOH và độ lệch chuẩn hóa. Cùng phân hoạch 5 vòng theo pin; ngưỡng là phân vị 99% điểm các pin học của từng vòng. Không chọn ngưỡng bằng tập kiểm thử. Dữ liệu học chưa có nhãn lỗi, nên cách làm giả định đa số diễn biến là thông thường, không chứng minh tập học hoàn toàn bình thường.</w:t>
+      </w:r>
+    </w:p>
+    <w:p>
+      <w:r>
+        <w:t>Kết hợp hai phương pháp theo phép hoặc cho 74 cờ trong 12.145 mẫu đủ lịch sử giai đoạn đầu và 135 cờ trong 7.646 mẫu đủ lịch sử tái sử dụng, tương ứng khoảng 0,61% và 1,77%. Cờ chu kỳ SOH khác các điểm nghi vấn tín hiệu điện áp/nhiệt độ ở phần kiểm tra dữ liệu, không cộng chung hai số đếm. Số cờ không phải số lỗi xác nhận hoặc độ chính xác. Chưa có nhãn lỗi nên không báo cáo precision, recall hay mức cải thiện phát hiện lỗi thực tế. Các điểm không bị tự sửa hoặc xóa.</w:t>
+      </w:r>
+    </w:p>
+    <w:p>
+      <w:r>
+        <w:t>Thiết kế dùng các quan sát SOH quá khứ của chính pin đang giám sát, nhưng không dùng tương lai để tạo nền. SOH tham chiếu cần phép đo dung lượng; kết quả không đồng nghĩa cảnh báo BMS trực tuyến hoặc chứng nhận pin nguy hiểm. Chưa có dữ liệu BMS trên xe, nên chưa thực hiện kiểm chứng thực tế. Kế hoạch và dữ liệu cần có được ghi riêng trong docs/kiem-chung-bms.md.</w:t>
+      </w:r>
+    </w:p>
+    <w:p>
+      <w:pPr>
+        <w:pStyle w:val="Heading2"/>
+      </w:pPr>
+      <w:r>
+        <w:t>4.10. Phương án khóa luận: Ridge–RF hiệu chỉnh phần dư</w:t>
+      </w:r>
+    </w:p>
+    <w:p>
+      <w:r>
+        <w:t>Tôi kiểm chứng cách kết hợp hai thuật toán có sẵn [3,4]: Ridge học xu hướng nền; Random Forest học phần dư r_train = y_train − Ridge(X_train). Kết quả cuối là SOH_dự_đoán = Ridge(X) + RF_phần_dư(X). Chỉ tập train được dùng để học bộ chuẩn hóa, hệ số Ridge và cây phần dư. Không dùng nhãn pin kiểm thử để hiệu chỉnh. Bảng đầu vào giữ đúng 12 đặc trưng, cùng 5 nhóm pin và seed 42; cấu hình được cố định, không tối ưu theo các điểm test.</w:t>
+      </w:r>
+    </w:p>
+    <w:tbl>
+      <w:tblPr>
+        <w:tblStyle w:val="TableGrid"/>
+        <w:tblW w:type="auto" w:w="0"/>
+        <w:tblLook w:firstColumn="1" w:firstRow="1" w:lastColumn="0" w:lastRow="0" w:noHBand="0" w:noVBand="1" w:val="04A0"/>
+      </w:tblPr>
+      <w:tblGrid>
+        <w:gridCol w:w="2197"/>
+        <w:gridCol w:w="2197"/>
+        <w:gridCol w:w="2197"/>
+        <w:gridCol w:w="2197"/>
+      </w:tblGrid>
+      <w:tr>
+        <w:trPr>
+          <w:tblHeader/>
+        </w:trPr>
+        <w:tc>
+          <w:tcPr>
+            <w:tcW w:type="dxa" w:w="2197"/>
+          </w:tcPr>
+          <w:p>
+            <w:pPr>
+              <w:spacing w:line="264" w:lineRule="auto"/>
+            </w:pPr>
+            <w:r>
+              <w:rPr>
+                <w:b/>
+                <w:sz w:val="18"/>
+              </w:rPr>
+              <w:t>Mô hình</w:t>
+            </w:r>
+          </w:p>
+        </w:tc>
+        <w:tc>
+          <w:tcPr>
+            <w:tcW w:type="dxa" w:w="2197"/>
+          </w:tcPr>
+          <w:p>
+            <w:pPr>
+              <w:spacing w:line="264" w:lineRule="auto"/>
+            </w:pPr>
+            <w:r>
+              <w:rPr>
+                <w:b/>
+                <w:sz w:val="18"/>
+              </w:rPr>
+              <w:t>MAE (điểm % SOH)</w:t>
+            </w:r>
+          </w:p>
+        </w:tc>
+        <w:tc>
+          <w:tcPr>
+            <w:tcW w:type="dxa" w:w="2197"/>
+          </w:tcPr>
+          <w:p>
+            <w:pPr>
+              <w:spacing w:line="264" w:lineRule="auto"/>
+            </w:pPr>
+            <w:r>
+              <w:rPr>
+                <w:b/>
+                <w:sz w:val="18"/>
+              </w:rPr>
+              <w:t>RMSE (điểm % SOH)</w:t>
+            </w:r>
+          </w:p>
+        </w:tc>
+        <w:tc>
+          <w:tcPr>
+            <w:tcW w:type="dxa" w:w="2197"/>
+          </w:tcPr>
+          <w:p>
+            <w:pPr>
+              <w:spacing w:line="264" w:lineRule="auto"/>
+            </w:pPr>
+            <w:r>
+              <w:rPr>
+                <w:b/>
+                <w:sz w:val="18"/>
+              </w:rPr>
+              <w:t>R²</w:t>
+            </w:r>
+          </w:p>
+        </w:tc>
+      </w:tr>
+      <w:tr>
+        <w:tc>
+          <w:tcPr>
+            <w:tcW w:type="dxa" w:w="2197"/>
+          </w:tcPr>
+          <w:p>
+            <w:pPr>
+              <w:spacing w:line="264" w:lineRule="auto"/>
+            </w:pPr>
+            <w:r>
+              <w:rPr>
+                <w:b w:val="0"/>
+                <w:sz w:val="18"/>
+              </w:rPr>
+              <w:t>Trung bình SOH — mốc cơ sở</w:t>
+            </w:r>
+          </w:p>
+        </w:tc>
+        <w:tc>
+          <w:tcPr>
+            <w:tcW w:type="dxa" w:w="2197"/>
+          </w:tcPr>
+          <w:p>
+            <w:pPr>
+              <w:spacing w:line="264" w:lineRule="auto"/>
+            </w:pPr>
+            <w:r>
+              <w:rPr>
+                <w:b w:val="0"/>
+                <w:sz w:val="18"/>
+              </w:rPr>
+              <w:t>13.246</w:t>
+            </w:r>
+          </w:p>
+        </w:tc>
+        <w:tc>
+          <w:tcPr>
+            <w:tcW w:type="dxa" w:w="2197"/>
+          </w:tcPr>
+          <w:p>
+            <w:pPr>
+              <w:spacing w:line="264" w:lineRule="auto"/>
+            </w:pPr>
+            <w:r>
+              <w:rPr>
+                <w:b w:val="0"/>
+                <w:sz w:val="18"/>
+              </w:rPr>
+              <w:t>15.249</w:t>
+            </w:r>
+          </w:p>
+        </w:tc>
+        <w:tc>
+          <w:tcPr>
+            <w:tcW w:type="dxa" w:w="2197"/>
+          </w:tcPr>
+          <w:p>
+            <w:pPr>
+              <w:spacing w:line="264" w:lineRule="auto"/>
+            </w:pPr>
+            <w:r>
+              <w:rPr>
+                <w:b w:val="0"/>
+                <w:sz w:val="18"/>
+              </w:rPr>
+              <w:t>-0.281</w:t>
+            </w:r>
+          </w:p>
+        </w:tc>
+      </w:tr>
+      <w:tr>
+        <w:tc>
+          <w:tcPr>
+            <w:tcW w:type="dxa" w:w="2197"/>
+          </w:tcPr>
+          <w:p>
+            <w:pPr>
+              <w:spacing w:line="264" w:lineRule="auto"/>
+            </w:pPr>
+            <w:r>
+              <w:rPr>
+                <w:b w:val="0"/>
+                <w:sz w:val="18"/>
+              </w:rPr>
+              <w:t>Hồi quy Ridge</w:t>
+            </w:r>
+          </w:p>
+        </w:tc>
+        <w:tc>
+          <w:tcPr>
+            <w:tcW w:type="dxa" w:w="2197"/>
+          </w:tcPr>
+          <w:p>
+            <w:pPr>
+              <w:spacing w:line="264" w:lineRule="auto"/>
+            </w:pPr>
+            <w:r>
+              <w:rPr>
+                <w:b w:val="0"/>
+                <w:sz w:val="18"/>
+              </w:rPr>
+              <w:t>2.582</w:t>
+            </w:r>
+          </w:p>
+        </w:tc>
+        <w:tc>
+          <w:tcPr>
+            <w:tcW w:type="dxa" w:w="2197"/>
+          </w:tcPr>
+          <w:p>
+            <w:pPr>
+              <w:spacing w:line="264" w:lineRule="auto"/>
+            </w:pPr>
+            <w:r>
+              <w:rPr>
+                <w:b w:val="0"/>
+                <w:sz w:val="18"/>
+              </w:rPr>
+              <w:t>3.299</w:t>
+            </w:r>
+          </w:p>
+        </w:tc>
+        <w:tc>
+          <w:tcPr>
+            <w:tcW w:type="dxa" w:w="2197"/>
+          </w:tcPr>
+          <w:p>
+            <w:pPr>
+              <w:spacing w:line="264" w:lineRule="auto"/>
+            </w:pPr>
+            <w:r>
+              <w:rPr>
+                <w:b w:val="0"/>
+                <w:sz w:val="18"/>
+              </w:rPr>
+              <w:t>0.933</w:t>
+            </w:r>
+          </w:p>
+        </w:tc>
+      </w:tr>
+      <w:tr>
+        <w:tc>
+          <w:tcPr>
+            <w:tcW w:type="dxa" w:w="2197"/>
+          </w:tcPr>
+          <w:p>
+            <w:pPr>
+              <w:spacing w:line="264" w:lineRule="auto"/>
+            </w:pPr>
+            <w:r>
+              <w:rPr>
+                <w:b w:val="0"/>
+                <w:sz w:val="18"/>
+              </w:rPr>
+              <w:t>Rừng ngẫu nhiên — Random Forest</w:t>
+            </w:r>
+          </w:p>
+        </w:tc>
+        <w:tc>
+          <w:tcPr>
+            <w:tcW w:type="dxa" w:w="2197"/>
+          </w:tcPr>
+          <w:p>
+            <w:pPr>
+              <w:spacing w:line="264" w:lineRule="auto"/>
+            </w:pPr>
+            <w:r>
+              <w:rPr>
+                <w:b w:val="0"/>
+                <w:sz w:val="18"/>
+              </w:rPr>
+              <w:t>1.619</w:t>
+            </w:r>
+          </w:p>
+        </w:tc>
+        <w:tc>
+          <w:tcPr>
+            <w:tcW w:type="dxa" w:w="2197"/>
+          </w:tcPr>
+          <w:p>
+            <w:pPr>
+              <w:spacing w:line="264" w:lineRule="auto"/>
+            </w:pPr>
+            <w:r>
+              <w:rPr>
+                <w:b w:val="0"/>
+                <w:sz w:val="18"/>
+              </w:rPr>
+              <w:t>2.157</w:t>
+            </w:r>
+          </w:p>
+        </w:tc>
+        <w:tc>
+          <w:tcPr>
+            <w:tcW w:type="dxa" w:w="2197"/>
+          </w:tcPr>
+          <w:p>
+            <w:pPr>
+              <w:spacing w:line="264" w:lineRule="auto"/>
+            </w:pPr>
+            <w:r>
+              <w:rPr>
+                <w:b w:val="0"/>
+                <w:sz w:val="18"/>
+              </w:rPr>
+              <w:t>0.970</w:t>
+            </w:r>
+          </w:p>
+        </w:tc>
+      </w:tr>
+      <w:tr>
+        <w:tc>
+          <w:tcPr>
+            <w:tcW w:type="dxa" w:w="2197"/>
+          </w:tcPr>
+          <w:p>
+            <w:pPr>
+              <w:spacing w:line="264" w:lineRule="auto"/>
+            </w:pPr>
+            <w:r>
+              <w:rPr>
+                <w:b w:val="0"/>
+                <w:sz w:val="18"/>
+              </w:rPr>
+              <w:t>Tăng cường cây — LightGBM</w:t>
+            </w:r>
+          </w:p>
+        </w:tc>
+        <w:tc>
+          <w:tcPr>
+            <w:tcW w:type="dxa" w:w="2197"/>
+          </w:tcPr>
+          <w:p>
+            <w:pPr>
+              <w:spacing w:line="264" w:lineRule="auto"/>
+            </w:pPr>
+            <w:r>
+              <w:rPr>
+                <w:b w:val="0"/>
+                <w:sz w:val="18"/>
+              </w:rPr>
+              <w:t>1.734</w:t>
+            </w:r>
+          </w:p>
+        </w:tc>
+        <w:tc>
+          <w:tcPr>
+            <w:tcW w:type="dxa" w:w="2197"/>
+          </w:tcPr>
+          <w:p>
+            <w:pPr>
+              <w:spacing w:line="264" w:lineRule="auto"/>
+            </w:pPr>
+            <w:r>
+              <w:rPr>
+                <w:b w:val="0"/>
+                <w:sz w:val="18"/>
+              </w:rPr>
+              <w:t>2.270</w:t>
+            </w:r>
+          </w:p>
+        </w:tc>
+        <w:tc>
+          <w:tcPr>
+            <w:tcW w:type="dxa" w:w="2197"/>
+          </w:tcPr>
+          <w:p>
+            <w:pPr>
+              <w:spacing w:line="264" w:lineRule="auto"/>
+            </w:pPr>
+            <w:r>
+              <w:rPr>
+                <w:b w:val="0"/>
+                <w:sz w:val="18"/>
+              </w:rPr>
+              <w:t>0.968</w:t>
+            </w:r>
+          </w:p>
+        </w:tc>
+      </w:tr>
+      <w:tr>
+        <w:tc>
+          <w:tcPr>
+            <w:tcW w:type="dxa" w:w="2197"/>
+          </w:tcPr>
+          <w:p>
+            <w:pPr>
+              <w:spacing w:line="264" w:lineRule="auto"/>
+            </w:pPr>
+            <w:r>
+              <w:rPr>
+                <w:b w:val="0"/>
+                <w:sz w:val="18"/>
+              </w:rPr>
+              <w:t>Mạng chuỗi thời gian — GRU</w:t>
+            </w:r>
+          </w:p>
+        </w:tc>
+        <w:tc>
+          <w:tcPr>
+            <w:tcW w:type="dxa" w:w="2197"/>
+          </w:tcPr>
+          <w:p>
+            <w:pPr>
+              <w:spacing w:line="264" w:lineRule="auto"/>
+            </w:pPr>
+            <w:r>
+              <w:rPr>
+                <w:b w:val="0"/>
+                <w:sz w:val="18"/>
+              </w:rPr>
+              <w:t>2.141</w:t>
+            </w:r>
+          </w:p>
+        </w:tc>
+        <w:tc>
+          <w:tcPr>
+            <w:tcW w:type="dxa" w:w="2197"/>
+          </w:tcPr>
+          <w:p>
+            <w:pPr>
+              <w:spacing w:line="264" w:lineRule="auto"/>
+            </w:pPr>
+            <w:r>
+              <w:rPr>
+                <w:b w:val="0"/>
+                <w:sz w:val="18"/>
+              </w:rPr>
+              <w:t>2.718</w:t>
+            </w:r>
+          </w:p>
+        </w:tc>
+        <w:tc>
+          <w:tcPr>
+            <w:tcW w:type="dxa" w:w="2197"/>
+          </w:tcPr>
+          <w:p>
+            <w:pPr>
+              <w:spacing w:line="264" w:lineRule="auto"/>
+            </w:pPr>
+            <w:r>
+              <w:rPr>
+                <w:b w:val="0"/>
+                <w:sz w:val="18"/>
+              </w:rPr>
+              <w:t>0.953</w:t>
+            </w:r>
+          </w:p>
+        </w:tc>
+      </w:tr>
+      <w:tr>
+        <w:tc>
+          <w:tcPr>
+            <w:tcW w:type="dxa" w:w="2197"/>
+          </w:tcPr>
+          <w:p>
+            <w:pPr>
+              <w:spacing w:line="264" w:lineRule="auto"/>
+            </w:pPr>
+            <w:r>
+              <w:rPr>
+                <w:b w:val="0"/>
+                <w:sz w:val="18"/>
+              </w:rPr>
+              <w:t>Ridge–RF hiệu chỉnh phần dư</w:t>
+            </w:r>
+          </w:p>
+        </w:tc>
+        <w:tc>
+          <w:tcPr>
+            <w:tcW w:type="dxa" w:w="2197"/>
+          </w:tcPr>
+          <w:p>
+            <w:pPr>
+              <w:spacing w:line="264" w:lineRule="auto"/>
+            </w:pPr>
+            <w:r>
+              <w:rPr>
+                <w:b w:val="0"/>
+                <w:sz w:val="18"/>
+              </w:rPr>
+              <w:t>1.612</w:t>
+            </w:r>
+          </w:p>
+        </w:tc>
+        <w:tc>
+          <w:tcPr>
+            <w:tcW w:type="dxa" w:w="2197"/>
+          </w:tcPr>
+          <w:p>
+            <w:pPr>
+              <w:spacing w:line="264" w:lineRule="auto"/>
+            </w:pPr>
+            <w:r>
+              <w:rPr>
+                <w:b w:val="0"/>
+                <w:sz w:val="18"/>
+              </w:rPr>
+              <w:t>2.160</w:t>
+            </w:r>
+          </w:p>
+        </w:tc>
+        <w:tc>
+          <w:tcPr>
+            <w:tcW w:type="dxa" w:w="2197"/>
+          </w:tcPr>
+          <w:p>
+            <w:pPr>
+              <w:spacing w:line="264" w:lineRule="auto"/>
+            </w:pPr>
+            <w:r>
+              <w:rPr>
+                <w:b w:val="0"/>
+                <w:sz w:val="18"/>
+              </w:rPr>
+              <w:t>0.971</w:t>
+            </w:r>
+          </w:p>
+        </w:tc>
+      </w:tr>
+    </w:tbl>
+    <w:p>
+      <w:r>
+        <w:t>Phương án phần dư đạt MAE khoảng 1,612 điểm phần trăm SOH so với 1,619 của RF; RMSE khoảng 2,160 so với 2,157. Cải thiện MAE nhỏ và RMSE hơi tăng, chưa chứng minh ưu thế rõ ràng. Kết quả theo từng pin, cả trường hợp tăng và giảm sai số, được giữ trong reports/hybrid_paired_comparison.csv. Chưa khảo sát nhiều seed hoặc bộ dữ liệu độc lập nên không khẳng định cải tiến có ý nghĩa thống kê hoặc tổng quát.</w:t>
+      </w:r>
+    </w:p>
+    <w:p>
+      <w:r>
+        <w:t>Đây là phương án kết hợp được triển khai và đánh giá trong khóa luận, không tuyên bố là thuật toán hoàn toàn mới hoặc công bố đầu tiên. Mô hình học lại toàn bộ được lưu riêng và có thể chọn trên trang dự đoán; kết quả này tách khỏi các dự đoán giữ riêng dùng đánh giá. Random Forest vẫn là lựa chọn mặc định của ứng dụng, không dùng chênh lệch nhỏ trên test để tuyên bố đổi mô hình tốt nhất.</w:t>
+      </w:r>
+    </w:p>
+    <w:p>
+      <w:pPr>
         <w:pStyle w:val="Heading1"/>
         <w:pageBreakBefore/>
       </w:pPr>
@@ -4219,7 +4776,7 @@
     </w:p>
     <w:p>
       <w:r>
-        <w:t>Lịch sử chỉ lưu trong phiên làm việc, không phải cơ sở dữ liệu người dùng. Phiếu kết quả có thể tải dưới dạng CSV và HTML. Trang chất lượng trình bày nguồn, tiến trình chọn dữ liệu và các điểm nghi vấn. Trang thông tin cung cấp trích dẫn và tài liệu nghiên cứu.</w:t>
+        <w:t>Lịch sử được giữ trong phiên; khi người dùng chọn lưu, kết quả và tên nguồn được ghi vào SQLite cục bộ trên máy chủ, không lưu nội dung CSV tải lên. Kho này dùng chung trên máy chủ, chưa có phân quyền tài khoản. Phiếu kết quả có thể tải dưới dạng CSV và HTML. Trang Xu hướng bất thường hiển thị chuỗi SOH, nền quá khứ, cờ của quy tắc/Isolation Forest và lý do; dữ liệu có thể xuất CSV. Trang chất lượng trình bày nguồn, tiến trình chọn dữ liệu và các điểm nghi vấn. Trang thông tin cung cấp trích dẫn và tài liệu nghiên cứu. Các trang kiểm tra đầu vào và demo trên pin giữ riêng được giữ lại. Phần phân rã dự đoán dùng hệ số Ridge và đường đi trong cây phù hợp với mô hình đang chọn, không gọi là SHAP hoặc quan hệ nhân quả.</w:t>
       </w:r>
     </w:p>
     <w:p>
@@ -4299,7 +4856,7 @@
     </w:p>
     <w:p>
       <w:r>
-        <w:t>Lần kiểm thử lưu trong reports/pytest-results.xml gồm 47 trường hợp, 0 thất bại, 0 lỗi và 0 bỏ qua. Tệp dataset_check.json ghi kết quả kiểm tra toàn bộ 10.505.065 dòng.</w:t>
+        <w:t>Lần kiểm thử lưu trong reports/pytest-results.xml gồm 74 trường hợp, 0 thất bại, 0 lỗi và 0 bỏ qua. Tệp dataset_check.json ghi kết quả kiểm tra toàn bộ 10.505.065 dòng.</w:t>
       </w:r>
     </w:p>
     <w:p>
@@ -4386,6 +4943,11 @@
     <w:p>
       <w:r>
         <w:t>[7] Pedregosa, F., et al. (2011). Scikit-learn: Machine Learning in Python. Journal of Machine Learning Research, 12, 2825–2830. https://jmlr.org/papers/v12/pedregosa11a.html.</w:t>
+      </w:r>
+    </w:p>
+    <w:p>
+      <w:r>
+        <w:t>[8] Liu, F. T., Ting, K. M., &amp; Zhou, Z.-H. (2008). Isolation Forest. IEEE ICDM, 413–422. https://doi.org/10.1109/ICDM.2008.17.</w:t>
       </w:r>
     </w:p>
     <w:p>

</xml_diff>

<commit_message>
Dự đoán SOH XJTU và báo cáo tiến độ giữa kỳ 10/11
</commit_message>
<xml_diff>
--- a/docs/bao-cao-khoa-luan.docx
+++ b/docs/bao-cao-khoa-luan.docx
@@ -162,32 +162,32 @@
     </w:p>
     <w:p>
       <w:r>
-        <w:t>Chương 5. Xây dựng sản phẩm Vincent D  ·  21</w:t>
+        <w:t>Chương 5. Xây dựng sản phẩm Vincent D  ·  22</w:t>
       </w:r>
     </w:p>
     <w:p>
       <w:r>
-        <w:t>Kết luận  ·  24</w:t>
+        <w:t>Kết luận  ·  25</w:t>
       </w:r>
     </w:p>
     <w:p>
       <w:r>
-        <w:t>Tài liệu tham khảo  ·  25</w:t>
+        <w:t>Tài liệu tham khảo  ·  26</w:t>
       </w:r>
     </w:p>
     <w:p>
       <w:r>
-        <w:t>Phụ lục A. Kết quả Random Forest theo pin  ·  26</w:t>
+        <w:t>Phụ lục A. Kết quả Random Forest theo pin  ·  28</w:t>
       </w:r>
     </w:p>
     <w:p>
       <w:r>
-        <w:t>Phụ lục B. Cấu trúc mã nguồn  ·  29</w:t>
+        <w:t>Phụ lục B. Cấu trúc mã nguồn  ·  31</w:t>
       </w:r>
     </w:p>
     <w:p>
       <w:r>
-        <w:t>Phụ lục C. Cấu hình thực nghiệm  ·  30</w:t>
+        <w:t>Phụ lục C. Cấu hình thực nghiệm  ·  32</w:t>
       </w:r>
     </w:p>
     <w:p>
@@ -4731,6 +4731,885 @@
     </w:p>
     <w:p>
       <w:pPr>
+        <w:pStyle w:val="Heading2"/>
+      </w:pPr>
+      <w:r>
+        <w:t>4.11. Thực nghiệm bổ sung trên nguồn XJTU</w:t>
+      </w:r>
+    </w:p>
+    <w:p>
+      <w:r>
+        <w:t>Chọn 23 pin thuộc Batch-1/2 trong 55 pin XJTU. Đã tải và kiểm tra CRC/SHA-256 của 23 thành viên MAT nguyên gốc từ ZIP tác giả. Tổng 46.215.511 điểm đo. 6.961 phần tử chu kỳ; 6.961 chu kỳ đạt kiểm tra đầu vào. 0 chu kỳ bị loại. 59 phép đo trùng giây được gộp trung bình trong cửa sổ dẫn xuất.</w:t>
+      </w:r>
+    </w:p>
+    <w:p>
+      <w:r>
+        <w:t>Không dùng 23 chu kỳ đầu 0,2C trong đánh giá chính; còn 6,938 chu kỳ xả 1C. Dùng SOH theo 2 Ah và 11 đặc trưng chung, chuẩn hóa dòng theo dung lượng danh định; không sửa dữ liệu nguồn. Giữ riêng 23 mã pin qua 5 vòng, seed 42, cấu hình cố định.</w:t>
+      </w:r>
+    </w:p>
+    <w:tbl>
+      <w:tblPr>
+        <w:tblStyle w:val="TableGrid"/>
+        <w:tblW w:type="auto" w:w="0"/>
+        <w:tblLook w:firstColumn="1" w:firstRow="1" w:lastColumn="0" w:lastRow="0" w:noHBand="0" w:noVBand="1" w:val="04A0"/>
+      </w:tblPr>
+      <w:tblGrid>
+        <w:gridCol w:w="2197"/>
+        <w:gridCol w:w="2197"/>
+        <w:gridCol w:w="2197"/>
+        <w:gridCol w:w="2197"/>
+      </w:tblGrid>
+      <w:tr>
+        <w:trPr>
+          <w:tblHeader/>
+        </w:trPr>
+        <w:tc>
+          <w:tcPr>
+            <w:tcW w:type="dxa" w:w="2197"/>
+          </w:tcPr>
+          <w:p>
+            <w:pPr>
+              <w:spacing w:line="264" w:lineRule="auto"/>
+            </w:pPr>
+            <w:r>
+              <w:rPr>
+                <w:b/>
+                <w:sz w:val="18"/>
+              </w:rPr>
+              <w:t>model</w:t>
+            </w:r>
+          </w:p>
+        </w:tc>
+        <w:tc>
+          <w:tcPr>
+            <w:tcW w:type="dxa" w:w="2197"/>
+          </w:tcPr>
+          <w:p>
+            <w:pPr>
+              <w:spacing w:line="264" w:lineRule="auto"/>
+            </w:pPr>
+            <w:r>
+              <w:rPr>
+                <w:b/>
+                <w:sz w:val="18"/>
+              </w:rPr>
+              <w:t>mae</w:t>
+            </w:r>
+          </w:p>
+        </w:tc>
+        <w:tc>
+          <w:tcPr>
+            <w:tcW w:type="dxa" w:w="2197"/>
+          </w:tcPr>
+          <w:p>
+            <w:pPr>
+              <w:spacing w:line="264" w:lineRule="auto"/>
+            </w:pPr>
+            <w:r>
+              <w:rPr>
+                <w:b/>
+                <w:sz w:val="18"/>
+              </w:rPr>
+              <w:t>rmse</w:t>
+            </w:r>
+          </w:p>
+        </w:tc>
+        <w:tc>
+          <w:tcPr>
+            <w:tcW w:type="dxa" w:w="2197"/>
+          </w:tcPr>
+          <w:p>
+            <w:pPr>
+              <w:spacing w:line="264" w:lineRule="auto"/>
+            </w:pPr>
+            <w:r>
+              <w:rPr>
+                <w:b/>
+                <w:sz w:val="18"/>
+              </w:rPr>
+              <w:t>r2</w:t>
+            </w:r>
+          </w:p>
+        </w:tc>
+      </w:tr>
+      <w:tr>
+        <w:tc>
+          <w:tcPr>
+            <w:tcW w:type="dxa" w:w="2197"/>
+          </w:tcPr>
+          <w:p>
+            <w:pPr>
+              <w:spacing w:line="264" w:lineRule="auto"/>
+            </w:pPr>
+            <w:r>
+              <w:rPr>
+                <w:b w:val="0"/>
+                <w:sz w:val="18"/>
+              </w:rPr>
+              <w:t>Mean baseline</w:t>
+            </w:r>
+          </w:p>
+        </w:tc>
+        <w:tc>
+          <w:tcPr>
+            <w:tcW w:type="dxa" w:w="2197"/>
+          </w:tcPr>
+          <w:p>
+            <w:pPr>
+              <w:spacing w:line="264" w:lineRule="auto"/>
+            </w:pPr>
+            <w:r>
+              <w:rPr>
+                <w:b w:val="0"/>
+                <w:sz w:val="18"/>
+              </w:rPr>
+              <w:t>3.759</w:t>
+            </w:r>
+          </w:p>
+        </w:tc>
+        <w:tc>
+          <w:tcPr>
+            <w:tcW w:type="dxa" w:w="2197"/>
+          </w:tcPr>
+          <w:p>
+            <w:pPr>
+              <w:spacing w:line="264" w:lineRule="auto"/>
+            </w:pPr>
+            <w:r>
+              <w:rPr>
+                <w:b w:val="0"/>
+                <w:sz w:val="18"/>
+              </w:rPr>
+              <w:t>4.720</w:t>
+            </w:r>
+          </w:p>
+        </w:tc>
+        <w:tc>
+          <w:tcPr>
+            <w:tcW w:type="dxa" w:w="2197"/>
+          </w:tcPr>
+          <w:p>
+            <w:pPr>
+              <w:spacing w:line="264" w:lineRule="auto"/>
+            </w:pPr>
+            <w:r>
+              <w:rPr>
+                <w:b w:val="0"/>
+                <w:sz w:val="18"/>
+              </w:rPr>
+              <w:t>-0.057</w:t>
+            </w:r>
+          </w:p>
+        </w:tc>
+      </w:tr>
+      <w:tr>
+        <w:tc>
+          <w:tcPr>
+            <w:tcW w:type="dxa" w:w="2197"/>
+          </w:tcPr>
+          <w:p>
+            <w:pPr>
+              <w:spacing w:line="264" w:lineRule="auto"/>
+            </w:pPr>
+            <w:r>
+              <w:rPr>
+                <w:b w:val="0"/>
+                <w:sz w:val="18"/>
+              </w:rPr>
+              <w:t>Ridge</w:t>
+            </w:r>
+          </w:p>
+        </w:tc>
+        <w:tc>
+          <w:tcPr>
+            <w:tcW w:type="dxa" w:w="2197"/>
+          </w:tcPr>
+          <w:p>
+            <w:pPr>
+              <w:spacing w:line="264" w:lineRule="auto"/>
+            </w:pPr>
+            <w:r>
+              <w:rPr>
+                <w:b w:val="0"/>
+                <w:sz w:val="18"/>
+              </w:rPr>
+              <w:t>0.971</w:t>
+            </w:r>
+          </w:p>
+        </w:tc>
+        <w:tc>
+          <w:tcPr>
+            <w:tcW w:type="dxa" w:w="2197"/>
+          </w:tcPr>
+          <w:p>
+            <w:pPr>
+              <w:spacing w:line="264" w:lineRule="auto"/>
+            </w:pPr>
+            <w:r>
+              <w:rPr>
+                <w:b w:val="0"/>
+                <w:sz w:val="18"/>
+              </w:rPr>
+              <w:t>1.205</w:t>
+            </w:r>
+          </w:p>
+        </w:tc>
+        <w:tc>
+          <w:tcPr>
+            <w:tcW w:type="dxa" w:w="2197"/>
+          </w:tcPr>
+          <w:p>
+            <w:pPr>
+              <w:spacing w:line="264" w:lineRule="auto"/>
+            </w:pPr>
+            <w:r>
+              <w:rPr>
+                <w:b w:val="0"/>
+                <w:sz w:val="18"/>
+              </w:rPr>
+              <w:t>0.920</w:t>
+            </w:r>
+          </w:p>
+        </w:tc>
+      </w:tr>
+      <w:tr>
+        <w:tc>
+          <w:tcPr>
+            <w:tcW w:type="dxa" w:w="2197"/>
+          </w:tcPr>
+          <w:p>
+            <w:pPr>
+              <w:spacing w:line="264" w:lineRule="auto"/>
+            </w:pPr>
+            <w:r>
+              <w:rPr>
+                <w:b w:val="0"/>
+                <w:sz w:val="18"/>
+              </w:rPr>
+              <w:t>Random Forest</w:t>
+            </w:r>
+          </w:p>
+        </w:tc>
+        <w:tc>
+          <w:tcPr>
+            <w:tcW w:type="dxa" w:w="2197"/>
+          </w:tcPr>
+          <w:p>
+            <w:pPr>
+              <w:spacing w:line="264" w:lineRule="auto"/>
+            </w:pPr>
+            <w:r>
+              <w:rPr>
+                <w:b w:val="0"/>
+                <w:sz w:val="18"/>
+              </w:rPr>
+              <w:t>0.577</w:t>
+            </w:r>
+          </w:p>
+        </w:tc>
+        <w:tc>
+          <w:tcPr>
+            <w:tcW w:type="dxa" w:w="2197"/>
+          </w:tcPr>
+          <w:p>
+            <w:pPr>
+              <w:spacing w:line="264" w:lineRule="auto"/>
+            </w:pPr>
+            <w:r>
+              <w:rPr>
+                <w:b w:val="0"/>
+                <w:sz w:val="18"/>
+              </w:rPr>
+              <w:t>0.764</w:t>
+            </w:r>
+          </w:p>
+        </w:tc>
+        <w:tc>
+          <w:tcPr>
+            <w:tcW w:type="dxa" w:w="2197"/>
+          </w:tcPr>
+          <w:p>
+            <w:pPr>
+              <w:spacing w:line="264" w:lineRule="auto"/>
+            </w:pPr>
+            <w:r>
+              <w:rPr>
+                <w:b w:val="0"/>
+                <w:sz w:val="18"/>
+              </w:rPr>
+              <w:t>0.965</w:t>
+            </w:r>
+          </w:p>
+        </w:tc>
+      </w:tr>
+      <w:tr>
+        <w:tc>
+          <w:tcPr>
+            <w:tcW w:type="dxa" w:w="2197"/>
+          </w:tcPr>
+          <w:p>
+            <w:pPr>
+              <w:spacing w:line="264" w:lineRule="auto"/>
+            </w:pPr>
+            <w:r>
+              <w:rPr>
+                <w:b w:val="0"/>
+                <w:sz w:val="18"/>
+              </w:rPr>
+              <w:t>LightGBM</w:t>
+            </w:r>
+          </w:p>
+        </w:tc>
+        <w:tc>
+          <w:tcPr>
+            <w:tcW w:type="dxa" w:w="2197"/>
+          </w:tcPr>
+          <w:p>
+            <w:pPr>
+              <w:spacing w:line="264" w:lineRule="auto"/>
+            </w:pPr>
+            <w:r>
+              <w:rPr>
+                <w:b w:val="0"/>
+                <w:sz w:val="18"/>
+              </w:rPr>
+              <w:t>0.596</w:t>
+            </w:r>
+          </w:p>
+        </w:tc>
+        <w:tc>
+          <w:tcPr>
+            <w:tcW w:type="dxa" w:w="2197"/>
+          </w:tcPr>
+          <w:p>
+            <w:pPr>
+              <w:spacing w:line="264" w:lineRule="auto"/>
+            </w:pPr>
+            <w:r>
+              <w:rPr>
+                <w:b w:val="0"/>
+                <w:sz w:val="18"/>
+              </w:rPr>
+              <w:t>0.787</w:t>
+            </w:r>
+          </w:p>
+        </w:tc>
+        <w:tc>
+          <w:tcPr>
+            <w:tcW w:type="dxa" w:w="2197"/>
+          </w:tcPr>
+          <w:p>
+            <w:pPr>
+              <w:spacing w:line="264" w:lineRule="auto"/>
+            </w:pPr>
+            <w:r>
+              <w:rPr>
+                <w:b w:val="0"/>
+                <w:sz w:val="18"/>
+              </w:rPr>
+              <w:t>0.964</w:t>
+            </w:r>
+          </w:p>
+        </w:tc>
+      </w:tr>
+      <w:tr>
+        <w:tc>
+          <w:tcPr>
+            <w:tcW w:type="dxa" w:w="2197"/>
+          </w:tcPr>
+          <w:p>
+            <w:pPr>
+              <w:spacing w:line="264" w:lineRule="auto"/>
+            </w:pPr>
+            <w:r>
+              <w:rPr>
+                <w:b w:val="0"/>
+                <w:sz w:val="18"/>
+              </w:rPr>
+              <w:t>Ridge-RF residual</w:t>
+            </w:r>
+          </w:p>
+        </w:tc>
+        <w:tc>
+          <w:tcPr>
+            <w:tcW w:type="dxa" w:w="2197"/>
+          </w:tcPr>
+          <w:p>
+            <w:pPr>
+              <w:spacing w:line="264" w:lineRule="auto"/>
+            </w:pPr>
+            <w:r>
+              <w:rPr>
+                <w:b w:val="0"/>
+                <w:sz w:val="18"/>
+              </w:rPr>
+              <w:t>0.666</w:t>
+            </w:r>
+          </w:p>
+        </w:tc>
+        <w:tc>
+          <w:tcPr>
+            <w:tcW w:type="dxa" w:w="2197"/>
+          </w:tcPr>
+          <w:p>
+            <w:pPr>
+              <w:spacing w:line="264" w:lineRule="auto"/>
+            </w:pPr>
+            <w:r>
+              <w:rPr>
+                <w:b w:val="0"/>
+                <w:sz w:val="18"/>
+              </w:rPr>
+              <w:t>0.828</w:t>
+            </w:r>
+          </w:p>
+        </w:tc>
+        <w:tc>
+          <w:tcPr>
+            <w:tcW w:type="dxa" w:w="2197"/>
+          </w:tcPr>
+          <w:p>
+            <w:pPr>
+              <w:spacing w:line="264" w:lineRule="auto"/>
+            </w:pPr>
+            <w:r>
+              <w:rPr>
+                <w:b w:val="0"/>
+                <w:sz w:val="18"/>
+              </w:rPr>
+              <w:t>0.960</w:t>
+            </w:r>
+          </w:p>
+        </w:tc>
+      </w:tr>
+      <w:tr>
+        <w:tc>
+          <w:tcPr>
+            <w:tcW w:type="dxa" w:w="2197"/>
+          </w:tcPr>
+          <w:p>
+            <w:pPr>
+              <w:spacing w:line="264" w:lineRule="auto"/>
+            </w:pPr>
+            <w:r>
+              <w:rPr>
+                <w:b w:val="0"/>
+                <w:sz w:val="18"/>
+              </w:rPr>
+              <w:t>RF multi-source</w:t>
+            </w:r>
+          </w:p>
+        </w:tc>
+        <w:tc>
+          <w:tcPr>
+            <w:tcW w:type="dxa" w:w="2197"/>
+          </w:tcPr>
+          <w:p>
+            <w:pPr>
+              <w:spacing w:line="264" w:lineRule="auto"/>
+            </w:pPr>
+            <w:r>
+              <w:rPr>
+                <w:b w:val="0"/>
+                <w:sz w:val="18"/>
+              </w:rPr>
+              <w:t>0.623</w:t>
+            </w:r>
+          </w:p>
+        </w:tc>
+        <w:tc>
+          <w:tcPr>
+            <w:tcW w:type="dxa" w:w="2197"/>
+          </w:tcPr>
+          <w:p>
+            <w:pPr>
+              <w:spacing w:line="264" w:lineRule="auto"/>
+            </w:pPr>
+            <w:r>
+              <w:rPr>
+                <w:b w:val="0"/>
+                <w:sz w:val="18"/>
+              </w:rPr>
+              <w:t>0.867</w:t>
+            </w:r>
+          </w:p>
+        </w:tc>
+        <w:tc>
+          <w:tcPr>
+            <w:tcW w:type="dxa" w:w="2197"/>
+          </w:tcPr>
+          <w:p>
+            <w:pPr>
+              <w:spacing w:line="264" w:lineRule="auto"/>
+            </w:pPr>
+            <w:r>
+              <w:rPr>
+                <w:b w:val="0"/>
+                <w:sz w:val="18"/>
+              </w:rPr>
+              <w:t>0.945</w:t>
+            </w:r>
+          </w:p>
+        </w:tc>
+      </w:tr>
+      <w:tr>
+        <w:tc>
+          <w:tcPr>
+            <w:tcW w:type="dxa" w:w="2197"/>
+          </w:tcPr>
+          <w:p>
+            <w:pPr>
+              <w:spacing w:line="264" w:lineRule="auto"/>
+            </w:pPr>
+            <w:r>
+              <w:rPr>
+                <w:b w:val="0"/>
+                <w:sz w:val="18"/>
+              </w:rPr>
+              <w:t>GRU</w:t>
+            </w:r>
+          </w:p>
+        </w:tc>
+        <w:tc>
+          <w:tcPr>
+            <w:tcW w:type="dxa" w:w="2197"/>
+          </w:tcPr>
+          <w:p>
+            <w:pPr>
+              <w:spacing w:line="264" w:lineRule="auto"/>
+            </w:pPr>
+            <w:r>
+              <w:rPr>
+                <w:b w:val="0"/>
+                <w:sz w:val="18"/>
+              </w:rPr>
+              <w:t>1.240</w:t>
+            </w:r>
+          </w:p>
+        </w:tc>
+        <w:tc>
+          <w:tcPr>
+            <w:tcW w:type="dxa" w:w="2197"/>
+          </w:tcPr>
+          <w:p>
+            <w:pPr>
+              <w:spacing w:line="264" w:lineRule="auto"/>
+            </w:pPr>
+            <w:r>
+              <w:rPr>
+                <w:b w:val="0"/>
+                <w:sz w:val="18"/>
+              </w:rPr>
+              <w:t>1.543</w:t>
+            </w:r>
+          </w:p>
+        </w:tc>
+        <w:tc>
+          <w:tcPr>
+            <w:tcW w:type="dxa" w:w="2197"/>
+          </w:tcPr>
+          <w:p>
+            <w:pPr>
+              <w:spacing w:line="264" w:lineRule="auto"/>
+            </w:pPr>
+            <w:r>
+              <w:rPr>
+                <w:b w:val="0"/>
+                <w:sz w:val="18"/>
+              </w:rPr>
+              <w:t>0.856</w:t>
+            </w:r>
+          </w:p>
+        </w:tc>
+      </w:tr>
+    </w:tbl>
+    <w:p>
+      <w:r>
+        <w:t>Random Forest riêng XJTU đạt MAE 0.577, RMSE 0.764, R² 0.965. RF đa nguồn đạt MAE 0.623, RMSE 0.867, R² 0.945. MAE tăng 0.047 điểm phần trăm SOH khi thêm nguồn SDU trong cấu hình đã cố định. Đây là thực nghiệm thăm dò trên cùng phân hoạch, chưa phải bằng chứng ưu thế thống kê hoặc cải thiện trên mọi điều kiện.</w:t>
+      </w:r>
+    </w:p>
+    <w:p>
+      <w:r>
+        <w:drawing>
+          <wp:inline xmlns:a="http://schemas.openxmlformats.org/drawingml/2006/main" xmlns:pic="http://schemas.openxmlformats.org/drawingml/2006/picture">
+            <wp:extent cx="5508000" cy="2002909"/>
+            <wp:docPr id="6" name="Picture 6"/>
+            <wp:cNvGraphicFramePr>
+              <a:graphicFrameLocks noChangeAspect="1"/>
+            </wp:cNvGraphicFramePr>
+            <a:graphic>
+              <a:graphicData uri="http://schemas.openxmlformats.org/drawingml/2006/picture">
+                <pic:pic>
+                  <pic:nvPicPr>
+                    <pic:cNvPr id="0" name="held_out_predictions.png"/>
+                    <pic:cNvPicPr/>
+                  </pic:nvPicPr>
+                  <pic:blipFill>
+                    <a:blip r:embed="rId15"/>
+                    <a:stretch>
+                      <a:fillRect/>
+                    </a:stretch>
+                  </pic:blipFill>
+                  <pic:spPr>
+                    <a:xfrm>
+                      <a:off x="0" y="0"/>
+                      <a:ext cx="5508000" cy="2002909"/>
+                    </a:xfrm>
+                    <a:prstGeom prst="rect"/>
+                  </pic:spPr>
+                </pic:pic>
+              </a:graphicData>
+            </a:graphic>
+          </wp:inline>
+        </w:drawing>
+      </w:r>
+    </w:p>
+    <w:p>
+      <w:pPr>
+        <w:jc w:val="center"/>
+      </w:pPr>
+      <w:r>
+        <w:t>Dự đoán RF trên hai pin XJTU giữ riêng</w:t>
+      </w:r>
+    </w:p>
+    <w:p>
+      <w:r>
+        <w:t>Chuyển miền chỉ học trên SDU, không dùng nhãn XJTU:</w:t>
+      </w:r>
+    </w:p>
+    <w:tbl>
+      <w:tblPr>
+        <w:tblStyle w:val="TableGrid"/>
+        <w:tblW w:type="auto" w:w="0"/>
+        <w:tblLook w:firstColumn="1" w:firstRow="1" w:lastColumn="0" w:lastRow="0" w:noHBand="0" w:noVBand="1" w:val="04A0"/>
+      </w:tblPr>
+      <w:tblGrid>
+        <w:gridCol w:w="2197"/>
+        <w:gridCol w:w="2197"/>
+        <w:gridCol w:w="2197"/>
+        <w:gridCol w:w="2197"/>
+      </w:tblGrid>
+      <w:tr>
+        <w:trPr>
+          <w:tblHeader/>
+        </w:trPr>
+        <w:tc>
+          <w:tcPr>
+            <w:tcW w:type="dxa" w:w="2197"/>
+          </w:tcPr>
+          <w:p>
+            <w:pPr>
+              <w:spacing w:line="264" w:lineRule="auto"/>
+            </w:pPr>
+            <w:r>
+              <w:rPr>
+                <w:b/>
+                <w:sz w:val="18"/>
+              </w:rPr>
+              <w:t>model</w:t>
+            </w:r>
+          </w:p>
+        </w:tc>
+        <w:tc>
+          <w:tcPr>
+            <w:tcW w:type="dxa" w:w="2197"/>
+          </w:tcPr>
+          <w:p>
+            <w:pPr>
+              <w:spacing w:line="264" w:lineRule="auto"/>
+            </w:pPr>
+            <w:r>
+              <w:rPr>
+                <w:b/>
+                <w:sz w:val="18"/>
+              </w:rPr>
+              <w:t>mae</w:t>
+            </w:r>
+          </w:p>
+        </w:tc>
+        <w:tc>
+          <w:tcPr>
+            <w:tcW w:type="dxa" w:w="2197"/>
+          </w:tcPr>
+          <w:p>
+            <w:pPr>
+              <w:spacing w:line="264" w:lineRule="auto"/>
+            </w:pPr>
+            <w:r>
+              <w:rPr>
+                <w:b/>
+                <w:sz w:val="18"/>
+              </w:rPr>
+              <w:t>rmse</w:t>
+            </w:r>
+          </w:p>
+        </w:tc>
+        <w:tc>
+          <w:tcPr>
+            <w:tcW w:type="dxa" w:w="2197"/>
+          </w:tcPr>
+          <w:p>
+            <w:pPr>
+              <w:spacing w:line="264" w:lineRule="auto"/>
+            </w:pPr>
+            <w:r>
+              <w:rPr>
+                <w:b/>
+                <w:sz w:val="18"/>
+              </w:rPr>
+              <w:t>r2</w:t>
+            </w:r>
+          </w:p>
+        </w:tc>
+      </w:tr>
+      <w:tr>
+        <w:tc>
+          <w:tcPr>
+            <w:tcW w:type="dxa" w:w="2197"/>
+          </w:tcPr>
+          <w:p>
+            <w:pPr>
+              <w:spacing w:line="264" w:lineRule="auto"/>
+            </w:pPr>
+            <w:r>
+              <w:rPr>
+                <w:b w:val="0"/>
+                <w:sz w:val="18"/>
+              </w:rPr>
+              <w:t>RF normalized</w:t>
+            </w:r>
+          </w:p>
+        </w:tc>
+        <w:tc>
+          <w:tcPr>
+            <w:tcW w:type="dxa" w:w="2197"/>
+          </w:tcPr>
+          <w:p>
+            <w:pPr>
+              <w:spacing w:line="264" w:lineRule="auto"/>
+            </w:pPr>
+            <w:r>
+              <w:rPr>
+                <w:b w:val="0"/>
+                <w:sz w:val="18"/>
+              </w:rPr>
+              <w:t>42.654</w:t>
+            </w:r>
+          </w:p>
+        </w:tc>
+        <w:tc>
+          <w:tcPr>
+            <w:tcW w:type="dxa" w:w="2197"/>
+          </w:tcPr>
+          <w:p>
+            <w:pPr>
+              <w:spacing w:line="264" w:lineRule="auto"/>
+            </w:pPr>
+            <w:r>
+              <w:rPr>
+                <w:b w:val="0"/>
+                <w:sz w:val="18"/>
+              </w:rPr>
+              <w:t>42.910</w:t>
+            </w:r>
+          </w:p>
+        </w:tc>
+        <w:tc>
+          <w:tcPr>
+            <w:tcW w:type="dxa" w:w="2197"/>
+          </w:tcPr>
+          <w:p>
+            <w:pPr>
+              <w:spacing w:line="264" w:lineRule="auto"/>
+            </w:pPr>
+            <w:r>
+              <w:rPr>
+                <w:b w:val="0"/>
+                <w:sz w:val="18"/>
+              </w:rPr>
+              <w:t>-89.595</w:t>
+            </w:r>
+          </w:p>
+        </w:tc>
+      </w:tr>
+      <w:tr>
+        <w:tc>
+          <w:tcPr>
+            <w:tcW w:type="dxa" w:w="2197"/>
+          </w:tcPr>
+          <w:p>
+            <w:pPr>
+              <w:spacing w:line="264" w:lineRule="auto"/>
+            </w:pPr>
+            <w:r>
+              <w:rPr>
+                <w:b w:val="0"/>
+                <w:sz w:val="18"/>
+              </w:rPr>
+              <w:t>RF original SDU</w:t>
+            </w:r>
+          </w:p>
+        </w:tc>
+        <w:tc>
+          <w:tcPr>
+            <w:tcW w:type="dxa" w:w="2197"/>
+          </w:tcPr>
+          <w:p>
+            <w:pPr>
+              <w:spacing w:line="264" w:lineRule="auto"/>
+            </w:pPr>
+            <w:r>
+              <w:rPr>
+                <w:b w:val="0"/>
+                <w:sz w:val="18"/>
+              </w:rPr>
+              <w:t>12.836</w:t>
+            </w:r>
+          </w:p>
+        </w:tc>
+        <w:tc>
+          <w:tcPr>
+            <w:tcW w:type="dxa" w:w="2197"/>
+          </w:tcPr>
+          <w:p>
+            <w:pPr>
+              <w:spacing w:line="264" w:lineRule="auto"/>
+            </w:pPr>
+            <w:r>
+              <w:rPr>
+                <w:b w:val="0"/>
+                <w:sz w:val="18"/>
+              </w:rPr>
+              <w:t>13.649</w:t>
+            </w:r>
+          </w:p>
+        </w:tc>
+        <w:tc>
+          <w:tcPr>
+            <w:tcW w:type="dxa" w:w="2197"/>
+          </w:tcPr>
+          <w:p>
+            <w:pPr>
+              <w:spacing w:line="264" w:lineRule="auto"/>
+            </w:pPr>
+            <w:r>
+              <w:rPr>
+                <w:b w:val="0"/>
+                <w:sz w:val="18"/>
+              </w:rPr>
+              <w:t>-8.045</w:t>
+            </w:r>
+          </w:p>
+        </w:tc>
+      </w:tr>
+    </w:tbl>
+    <w:p>
+      <w:r>
+        <w:t>Các phép kiểm tra batch và bảng theo từng pin nằm trong reports/xjtu và docs/thuc-nghiem-xjtu.md. Kết quả vẫn thuộc tế bào trong phòng thí nghiệm; chưa là bằng chứng mô hình dùng được trên xe.</w:t>
+      </w:r>
+    </w:p>
+    <w:p>
+      <w:pPr>
         <w:pStyle w:val="Heading1"/>
         <w:pageBreakBefore/>
       </w:pPr>
@@ -4781,10 +5660,15 @@
     </w:p>
     <w:p>
       <w:r>
+        <w:t>Mục Thực nghiệm XJTU bổ sung bảng kiểm thử nguồn độc lập, biểu đồ theo pin, nguồn và dự đoán MAT riêng. RF riêng XJTU và RF đa nguồn dùng dòng chuẩn hóa theo dung lượng danh định; điểm refit ứng dụng được phân biệt với kiểm thử pin giữ riêng.</w:t>
+      </w:r>
+    </w:p>
+    <w:p>
+      <w:r>
         <w:drawing>
           <wp:inline xmlns:a="http://schemas.openxmlformats.org/drawingml/2006/main" xmlns:pic="http://schemas.openxmlformats.org/drawingml/2006/picture">
             <wp:extent cx="5508000" cy="3825000"/>
-            <wp:docPr id="6" name="Picture 6"/>
+            <wp:docPr id="7" name="Picture 7"/>
             <wp:cNvGraphicFramePr>
               <a:graphicFrameLocks noChangeAspect="1"/>
             </wp:cNvGraphicFramePr>
@@ -4796,7 +5680,7 @@
                     <pic:cNvPicPr/>
                   </pic:nvPicPr>
                   <pic:blipFill>
-                    <a:blip r:embed="rId15"/>
+                    <a:blip r:embed="rId16"/>
                     <a:stretch>
                       <a:fillRect/>
                     </a:stretch>
@@ -4856,7 +5740,7 @@
     </w:p>
     <w:p>
       <w:r>
-        <w:t>Lần kiểm thử lưu trong reports/pytest-results.xml gồm 74 trường hợp, 0 thất bại, 0 lỗi và 0 bỏ qua. Tệp dataset_check.json ghi kết quả kiểm tra toàn bộ 10.505.065 dòng.</w:t>
+        <w:t>Lần kiểm thử lưu trong reports/pytest-results.xml gồm 82 trường hợp, 0 thất bại, 0 lỗi và 0 bỏ qua. Tệp dataset_check.json ghi kết quả kiểm tra toàn bộ 10.505.065 dòng.</w:t>
       </w:r>
     </w:p>
     <w:p>
@@ -4948,6 +5832,16 @@
     <w:p>
       <w:r>
         <w:t>[8] Liu, F. T., Ting, K. M., &amp; Zhou, Z.-H. (2008). Isolation Forest. IEEE ICDM, 413–422. https://doi.org/10.1109/ICDM.2008.17.</w:t>
+      </w:r>
+    </w:p>
+    <w:p>
+      <w:r>
+        <w:t>[9] Wang, F. (2024). XJTU Battery Dataset [Data set]. Zenodo. https://doi.org/10.5281/zenodo.10963339. CC BY 4.0.</w:t>
+      </w:r>
+    </w:p>
+    <w:p>
+      <w:r>
+        <w:t>[10] Wang, F., Zhai, Z., Zhao, Z., et al. (2024). Physics-informed neural network for lithium-ion battery degradation stable modeling and prognosis. Nature Communications, 15, 4332. https://doi.org/10.1038/s41467-024-48779-z.</w:t>
       </w:r>
     </w:p>
     <w:p>

</xml_diff>

<commit_message>
Sản phẩm SDU và XJTU, kết quả kiểm thử và hồ sơ giữa kỳ 10/11
</commit_message>
<xml_diff>
--- a/docs/bao-cao-khoa-luan.docx
+++ b/docs/bao-cao-khoa-luan.docx
@@ -162,32 +162,32 @@
     </w:p>
     <w:p>
       <w:r>
-        <w:t>Chương 5. Xây dựng sản phẩm Vincent D  ·  21</w:t>
+        <w:t>Chương 5. Xây dựng sản phẩm Vincent D  ·  22</w:t>
       </w:r>
     </w:p>
     <w:p>
       <w:r>
-        <w:t>Kết luận  ·  24</w:t>
+        <w:t>Kết luận  ·  25</w:t>
       </w:r>
     </w:p>
     <w:p>
       <w:r>
-        <w:t>Tài liệu tham khảo  ·  25</w:t>
+        <w:t>Tài liệu tham khảo  ·  26</w:t>
       </w:r>
     </w:p>
     <w:p>
       <w:r>
-        <w:t>Phụ lục A. Kết quả Random Forest theo pin  ·  26</w:t>
+        <w:t>Phụ lục A. Kết quả Random Forest theo pin  ·  28</w:t>
       </w:r>
     </w:p>
     <w:p>
       <w:r>
-        <w:t>Phụ lục B. Cấu trúc mã nguồn  ·  29</w:t>
+        <w:t>Phụ lục B. Cấu trúc mã nguồn  ·  31</w:t>
       </w:r>
     </w:p>
     <w:p>
       <w:r>
-        <w:t>Phụ lục C. Cấu hình thực nghiệm  ·  30</w:t>
+        <w:t>Phụ lục C. Cấu hình thực nghiệm  ·  32</w:t>
       </w:r>
     </w:p>
     <w:p>
@@ -4731,6 +4731,885 @@
     </w:p>
     <w:p>
       <w:pPr>
+        <w:pStyle w:val="Heading2"/>
+      </w:pPr>
+      <w:r>
+        <w:t>4.11. Thực nghiệm bổ sung trên nguồn XJTU</w:t>
+      </w:r>
+    </w:p>
+    <w:p>
+      <w:r>
+        <w:t>Chọn 23 pin thuộc Batch-1/2 trong 55 pin XJTU. Đã tải và kiểm tra CRC/SHA-256 của 23 thành viên MAT nguyên gốc từ ZIP tác giả. Tổng 46.215.511 điểm đo. 6.961 phần tử chu kỳ; 6.961 chu kỳ đạt kiểm tra đầu vào. 0 chu kỳ bị loại. 59 phép đo trùng giây được gộp trung bình trong cửa sổ dẫn xuất.</w:t>
+      </w:r>
+    </w:p>
+    <w:p>
+      <w:r>
+        <w:t>Không dùng 23 chu kỳ đầu 0,2C trong đánh giá chính; còn 6,938 chu kỳ xả 1C. Dùng SOH theo 2 Ah và 11 đặc trưng chung, chuẩn hóa dòng theo dung lượng danh định; không sửa dữ liệu nguồn. Giữ riêng 23 mã pin qua 5 vòng, seed 42, cấu hình cố định.</w:t>
+      </w:r>
+    </w:p>
+    <w:tbl>
+      <w:tblPr>
+        <w:tblStyle w:val="TableGrid"/>
+        <w:tblW w:type="auto" w:w="0"/>
+        <w:tblLook w:firstColumn="1" w:firstRow="1" w:lastColumn="0" w:lastRow="0" w:noHBand="0" w:noVBand="1" w:val="04A0"/>
+      </w:tblPr>
+      <w:tblGrid>
+        <w:gridCol w:w="2197"/>
+        <w:gridCol w:w="2197"/>
+        <w:gridCol w:w="2197"/>
+        <w:gridCol w:w="2197"/>
+      </w:tblGrid>
+      <w:tr>
+        <w:trPr>
+          <w:tblHeader/>
+        </w:trPr>
+        <w:tc>
+          <w:tcPr>
+            <w:tcW w:type="dxa" w:w="2197"/>
+          </w:tcPr>
+          <w:p>
+            <w:pPr>
+              <w:spacing w:line="264" w:lineRule="auto"/>
+            </w:pPr>
+            <w:r>
+              <w:rPr>
+                <w:b/>
+                <w:sz w:val="18"/>
+              </w:rPr>
+              <w:t>model</w:t>
+            </w:r>
+          </w:p>
+        </w:tc>
+        <w:tc>
+          <w:tcPr>
+            <w:tcW w:type="dxa" w:w="2197"/>
+          </w:tcPr>
+          <w:p>
+            <w:pPr>
+              <w:spacing w:line="264" w:lineRule="auto"/>
+            </w:pPr>
+            <w:r>
+              <w:rPr>
+                <w:b/>
+                <w:sz w:val="18"/>
+              </w:rPr>
+              <w:t>mae</w:t>
+            </w:r>
+          </w:p>
+        </w:tc>
+        <w:tc>
+          <w:tcPr>
+            <w:tcW w:type="dxa" w:w="2197"/>
+          </w:tcPr>
+          <w:p>
+            <w:pPr>
+              <w:spacing w:line="264" w:lineRule="auto"/>
+            </w:pPr>
+            <w:r>
+              <w:rPr>
+                <w:b/>
+                <w:sz w:val="18"/>
+              </w:rPr>
+              <w:t>rmse</w:t>
+            </w:r>
+          </w:p>
+        </w:tc>
+        <w:tc>
+          <w:tcPr>
+            <w:tcW w:type="dxa" w:w="2197"/>
+          </w:tcPr>
+          <w:p>
+            <w:pPr>
+              <w:spacing w:line="264" w:lineRule="auto"/>
+            </w:pPr>
+            <w:r>
+              <w:rPr>
+                <w:b/>
+                <w:sz w:val="18"/>
+              </w:rPr>
+              <w:t>r2</w:t>
+            </w:r>
+          </w:p>
+        </w:tc>
+      </w:tr>
+      <w:tr>
+        <w:tc>
+          <w:tcPr>
+            <w:tcW w:type="dxa" w:w="2197"/>
+          </w:tcPr>
+          <w:p>
+            <w:pPr>
+              <w:spacing w:line="264" w:lineRule="auto"/>
+            </w:pPr>
+            <w:r>
+              <w:rPr>
+                <w:b w:val="0"/>
+                <w:sz w:val="18"/>
+              </w:rPr>
+              <w:t>Mean baseline</w:t>
+            </w:r>
+          </w:p>
+        </w:tc>
+        <w:tc>
+          <w:tcPr>
+            <w:tcW w:type="dxa" w:w="2197"/>
+          </w:tcPr>
+          <w:p>
+            <w:pPr>
+              <w:spacing w:line="264" w:lineRule="auto"/>
+            </w:pPr>
+            <w:r>
+              <w:rPr>
+                <w:b w:val="0"/>
+                <w:sz w:val="18"/>
+              </w:rPr>
+              <w:t>3.759</w:t>
+            </w:r>
+          </w:p>
+        </w:tc>
+        <w:tc>
+          <w:tcPr>
+            <w:tcW w:type="dxa" w:w="2197"/>
+          </w:tcPr>
+          <w:p>
+            <w:pPr>
+              <w:spacing w:line="264" w:lineRule="auto"/>
+            </w:pPr>
+            <w:r>
+              <w:rPr>
+                <w:b w:val="0"/>
+                <w:sz w:val="18"/>
+              </w:rPr>
+              <w:t>4.720</w:t>
+            </w:r>
+          </w:p>
+        </w:tc>
+        <w:tc>
+          <w:tcPr>
+            <w:tcW w:type="dxa" w:w="2197"/>
+          </w:tcPr>
+          <w:p>
+            <w:pPr>
+              <w:spacing w:line="264" w:lineRule="auto"/>
+            </w:pPr>
+            <w:r>
+              <w:rPr>
+                <w:b w:val="0"/>
+                <w:sz w:val="18"/>
+              </w:rPr>
+              <w:t>-0.057</w:t>
+            </w:r>
+          </w:p>
+        </w:tc>
+      </w:tr>
+      <w:tr>
+        <w:tc>
+          <w:tcPr>
+            <w:tcW w:type="dxa" w:w="2197"/>
+          </w:tcPr>
+          <w:p>
+            <w:pPr>
+              <w:spacing w:line="264" w:lineRule="auto"/>
+            </w:pPr>
+            <w:r>
+              <w:rPr>
+                <w:b w:val="0"/>
+                <w:sz w:val="18"/>
+              </w:rPr>
+              <w:t>Ridge</w:t>
+            </w:r>
+          </w:p>
+        </w:tc>
+        <w:tc>
+          <w:tcPr>
+            <w:tcW w:type="dxa" w:w="2197"/>
+          </w:tcPr>
+          <w:p>
+            <w:pPr>
+              <w:spacing w:line="264" w:lineRule="auto"/>
+            </w:pPr>
+            <w:r>
+              <w:rPr>
+                <w:b w:val="0"/>
+                <w:sz w:val="18"/>
+              </w:rPr>
+              <w:t>0.971</w:t>
+            </w:r>
+          </w:p>
+        </w:tc>
+        <w:tc>
+          <w:tcPr>
+            <w:tcW w:type="dxa" w:w="2197"/>
+          </w:tcPr>
+          <w:p>
+            <w:pPr>
+              <w:spacing w:line="264" w:lineRule="auto"/>
+            </w:pPr>
+            <w:r>
+              <w:rPr>
+                <w:b w:val="0"/>
+                <w:sz w:val="18"/>
+              </w:rPr>
+              <w:t>1.205</w:t>
+            </w:r>
+          </w:p>
+        </w:tc>
+        <w:tc>
+          <w:tcPr>
+            <w:tcW w:type="dxa" w:w="2197"/>
+          </w:tcPr>
+          <w:p>
+            <w:pPr>
+              <w:spacing w:line="264" w:lineRule="auto"/>
+            </w:pPr>
+            <w:r>
+              <w:rPr>
+                <w:b w:val="0"/>
+                <w:sz w:val="18"/>
+              </w:rPr>
+              <w:t>0.920</w:t>
+            </w:r>
+          </w:p>
+        </w:tc>
+      </w:tr>
+      <w:tr>
+        <w:tc>
+          <w:tcPr>
+            <w:tcW w:type="dxa" w:w="2197"/>
+          </w:tcPr>
+          <w:p>
+            <w:pPr>
+              <w:spacing w:line="264" w:lineRule="auto"/>
+            </w:pPr>
+            <w:r>
+              <w:rPr>
+                <w:b w:val="0"/>
+                <w:sz w:val="18"/>
+              </w:rPr>
+              <w:t>Random Forest</w:t>
+            </w:r>
+          </w:p>
+        </w:tc>
+        <w:tc>
+          <w:tcPr>
+            <w:tcW w:type="dxa" w:w="2197"/>
+          </w:tcPr>
+          <w:p>
+            <w:pPr>
+              <w:spacing w:line="264" w:lineRule="auto"/>
+            </w:pPr>
+            <w:r>
+              <w:rPr>
+                <w:b w:val="0"/>
+                <w:sz w:val="18"/>
+              </w:rPr>
+              <w:t>0.577</w:t>
+            </w:r>
+          </w:p>
+        </w:tc>
+        <w:tc>
+          <w:tcPr>
+            <w:tcW w:type="dxa" w:w="2197"/>
+          </w:tcPr>
+          <w:p>
+            <w:pPr>
+              <w:spacing w:line="264" w:lineRule="auto"/>
+            </w:pPr>
+            <w:r>
+              <w:rPr>
+                <w:b w:val="0"/>
+                <w:sz w:val="18"/>
+              </w:rPr>
+              <w:t>0.764</w:t>
+            </w:r>
+          </w:p>
+        </w:tc>
+        <w:tc>
+          <w:tcPr>
+            <w:tcW w:type="dxa" w:w="2197"/>
+          </w:tcPr>
+          <w:p>
+            <w:pPr>
+              <w:spacing w:line="264" w:lineRule="auto"/>
+            </w:pPr>
+            <w:r>
+              <w:rPr>
+                <w:b w:val="0"/>
+                <w:sz w:val="18"/>
+              </w:rPr>
+              <w:t>0.965</w:t>
+            </w:r>
+          </w:p>
+        </w:tc>
+      </w:tr>
+      <w:tr>
+        <w:tc>
+          <w:tcPr>
+            <w:tcW w:type="dxa" w:w="2197"/>
+          </w:tcPr>
+          <w:p>
+            <w:pPr>
+              <w:spacing w:line="264" w:lineRule="auto"/>
+            </w:pPr>
+            <w:r>
+              <w:rPr>
+                <w:b w:val="0"/>
+                <w:sz w:val="18"/>
+              </w:rPr>
+              <w:t>LightGBM</w:t>
+            </w:r>
+          </w:p>
+        </w:tc>
+        <w:tc>
+          <w:tcPr>
+            <w:tcW w:type="dxa" w:w="2197"/>
+          </w:tcPr>
+          <w:p>
+            <w:pPr>
+              <w:spacing w:line="264" w:lineRule="auto"/>
+            </w:pPr>
+            <w:r>
+              <w:rPr>
+                <w:b w:val="0"/>
+                <w:sz w:val="18"/>
+              </w:rPr>
+              <w:t>0.596</w:t>
+            </w:r>
+          </w:p>
+        </w:tc>
+        <w:tc>
+          <w:tcPr>
+            <w:tcW w:type="dxa" w:w="2197"/>
+          </w:tcPr>
+          <w:p>
+            <w:pPr>
+              <w:spacing w:line="264" w:lineRule="auto"/>
+            </w:pPr>
+            <w:r>
+              <w:rPr>
+                <w:b w:val="0"/>
+                <w:sz w:val="18"/>
+              </w:rPr>
+              <w:t>0.787</w:t>
+            </w:r>
+          </w:p>
+        </w:tc>
+        <w:tc>
+          <w:tcPr>
+            <w:tcW w:type="dxa" w:w="2197"/>
+          </w:tcPr>
+          <w:p>
+            <w:pPr>
+              <w:spacing w:line="264" w:lineRule="auto"/>
+            </w:pPr>
+            <w:r>
+              <w:rPr>
+                <w:b w:val="0"/>
+                <w:sz w:val="18"/>
+              </w:rPr>
+              <w:t>0.964</w:t>
+            </w:r>
+          </w:p>
+        </w:tc>
+      </w:tr>
+      <w:tr>
+        <w:tc>
+          <w:tcPr>
+            <w:tcW w:type="dxa" w:w="2197"/>
+          </w:tcPr>
+          <w:p>
+            <w:pPr>
+              <w:spacing w:line="264" w:lineRule="auto"/>
+            </w:pPr>
+            <w:r>
+              <w:rPr>
+                <w:b w:val="0"/>
+                <w:sz w:val="18"/>
+              </w:rPr>
+              <w:t>Ridge-RF residual</w:t>
+            </w:r>
+          </w:p>
+        </w:tc>
+        <w:tc>
+          <w:tcPr>
+            <w:tcW w:type="dxa" w:w="2197"/>
+          </w:tcPr>
+          <w:p>
+            <w:pPr>
+              <w:spacing w:line="264" w:lineRule="auto"/>
+            </w:pPr>
+            <w:r>
+              <w:rPr>
+                <w:b w:val="0"/>
+                <w:sz w:val="18"/>
+              </w:rPr>
+              <w:t>0.666</w:t>
+            </w:r>
+          </w:p>
+        </w:tc>
+        <w:tc>
+          <w:tcPr>
+            <w:tcW w:type="dxa" w:w="2197"/>
+          </w:tcPr>
+          <w:p>
+            <w:pPr>
+              <w:spacing w:line="264" w:lineRule="auto"/>
+            </w:pPr>
+            <w:r>
+              <w:rPr>
+                <w:b w:val="0"/>
+                <w:sz w:val="18"/>
+              </w:rPr>
+              <w:t>0.828</w:t>
+            </w:r>
+          </w:p>
+        </w:tc>
+        <w:tc>
+          <w:tcPr>
+            <w:tcW w:type="dxa" w:w="2197"/>
+          </w:tcPr>
+          <w:p>
+            <w:pPr>
+              <w:spacing w:line="264" w:lineRule="auto"/>
+            </w:pPr>
+            <w:r>
+              <w:rPr>
+                <w:b w:val="0"/>
+                <w:sz w:val="18"/>
+              </w:rPr>
+              <w:t>0.960</w:t>
+            </w:r>
+          </w:p>
+        </w:tc>
+      </w:tr>
+      <w:tr>
+        <w:tc>
+          <w:tcPr>
+            <w:tcW w:type="dxa" w:w="2197"/>
+          </w:tcPr>
+          <w:p>
+            <w:pPr>
+              <w:spacing w:line="264" w:lineRule="auto"/>
+            </w:pPr>
+            <w:r>
+              <w:rPr>
+                <w:b w:val="0"/>
+                <w:sz w:val="18"/>
+              </w:rPr>
+              <w:t>RF multi-source</w:t>
+            </w:r>
+          </w:p>
+        </w:tc>
+        <w:tc>
+          <w:tcPr>
+            <w:tcW w:type="dxa" w:w="2197"/>
+          </w:tcPr>
+          <w:p>
+            <w:pPr>
+              <w:spacing w:line="264" w:lineRule="auto"/>
+            </w:pPr>
+            <w:r>
+              <w:rPr>
+                <w:b w:val="0"/>
+                <w:sz w:val="18"/>
+              </w:rPr>
+              <w:t>0.623</w:t>
+            </w:r>
+          </w:p>
+        </w:tc>
+        <w:tc>
+          <w:tcPr>
+            <w:tcW w:type="dxa" w:w="2197"/>
+          </w:tcPr>
+          <w:p>
+            <w:pPr>
+              <w:spacing w:line="264" w:lineRule="auto"/>
+            </w:pPr>
+            <w:r>
+              <w:rPr>
+                <w:b w:val="0"/>
+                <w:sz w:val="18"/>
+              </w:rPr>
+              <w:t>0.867</w:t>
+            </w:r>
+          </w:p>
+        </w:tc>
+        <w:tc>
+          <w:tcPr>
+            <w:tcW w:type="dxa" w:w="2197"/>
+          </w:tcPr>
+          <w:p>
+            <w:pPr>
+              <w:spacing w:line="264" w:lineRule="auto"/>
+            </w:pPr>
+            <w:r>
+              <w:rPr>
+                <w:b w:val="0"/>
+                <w:sz w:val="18"/>
+              </w:rPr>
+              <w:t>0.945</w:t>
+            </w:r>
+          </w:p>
+        </w:tc>
+      </w:tr>
+      <w:tr>
+        <w:tc>
+          <w:tcPr>
+            <w:tcW w:type="dxa" w:w="2197"/>
+          </w:tcPr>
+          <w:p>
+            <w:pPr>
+              <w:spacing w:line="264" w:lineRule="auto"/>
+            </w:pPr>
+            <w:r>
+              <w:rPr>
+                <w:b w:val="0"/>
+                <w:sz w:val="18"/>
+              </w:rPr>
+              <w:t>GRU</w:t>
+            </w:r>
+          </w:p>
+        </w:tc>
+        <w:tc>
+          <w:tcPr>
+            <w:tcW w:type="dxa" w:w="2197"/>
+          </w:tcPr>
+          <w:p>
+            <w:pPr>
+              <w:spacing w:line="264" w:lineRule="auto"/>
+            </w:pPr>
+            <w:r>
+              <w:rPr>
+                <w:b w:val="0"/>
+                <w:sz w:val="18"/>
+              </w:rPr>
+              <w:t>1.240</w:t>
+            </w:r>
+          </w:p>
+        </w:tc>
+        <w:tc>
+          <w:tcPr>
+            <w:tcW w:type="dxa" w:w="2197"/>
+          </w:tcPr>
+          <w:p>
+            <w:pPr>
+              <w:spacing w:line="264" w:lineRule="auto"/>
+            </w:pPr>
+            <w:r>
+              <w:rPr>
+                <w:b w:val="0"/>
+                <w:sz w:val="18"/>
+              </w:rPr>
+              <w:t>1.543</w:t>
+            </w:r>
+          </w:p>
+        </w:tc>
+        <w:tc>
+          <w:tcPr>
+            <w:tcW w:type="dxa" w:w="2197"/>
+          </w:tcPr>
+          <w:p>
+            <w:pPr>
+              <w:spacing w:line="264" w:lineRule="auto"/>
+            </w:pPr>
+            <w:r>
+              <w:rPr>
+                <w:b w:val="0"/>
+                <w:sz w:val="18"/>
+              </w:rPr>
+              <w:t>0.856</w:t>
+            </w:r>
+          </w:p>
+        </w:tc>
+      </w:tr>
+    </w:tbl>
+    <w:p>
+      <w:r>
+        <w:t>Random Forest riêng XJTU đạt MAE 0.577, RMSE 0.764, R² 0.965. RF đa nguồn đạt MAE 0.623, RMSE 0.867, R² 0.945. MAE tăng 0.047 điểm phần trăm SOH khi thêm nguồn SDU trong cấu hình đã cố định. Đây là thực nghiệm thăm dò trên cùng phân hoạch, chưa phải bằng chứng ưu thế thống kê hoặc cải thiện trên mọi điều kiện.</w:t>
+      </w:r>
+    </w:p>
+    <w:p>
+      <w:r>
+        <w:drawing>
+          <wp:inline xmlns:a="http://schemas.openxmlformats.org/drawingml/2006/main" xmlns:pic="http://schemas.openxmlformats.org/drawingml/2006/picture">
+            <wp:extent cx="5508000" cy="2002909"/>
+            <wp:docPr id="6" name="Picture 6"/>
+            <wp:cNvGraphicFramePr>
+              <a:graphicFrameLocks noChangeAspect="1"/>
+            </wp:cNvGraphicFramePr>
+            <a:graphic>
+              <a:graphicData uri="http://schemas.openxmlformats.org/drawingml/2006/picture">
+                <pic:pic>
+                  <pic:nvPicPr>
+                    <pic:cNvPr id="0" name="held_out_predictions.png"/>
+                    <pic:cNvPicPr/>
+                  </pic:nvPicPr>
+                  <pic:blipFill>
+                    <a:blip r:embed="rId15"/>
+                    <a:stretch>
+                      <a:fillRect/>
+                    </a:stretch>
+                  </pic:blipFill>
+                  <pic:spPr>
+                    <a:xfrm>
+                      <a:off x="0" y="0"/>
+                      <a:ext cx="5508000" cy="2002909"/>
+                    </a:xfrm>
+                    <a:prstGeom prst="rect"/>
+                  </pic:spPr>
+                </pic:pic>
+              </a:graphicData>
+            </a:graphic>
+          </wp:inline>
+        </w:drawing>
+      </w:r>
+    </w:p>
+    <w:p>
+      <w:pPr>
+        <w:jc w:val="center"/>
+      </w:pPr>
+      <w:r>
+        <w:t>Dự đoán RF trên hai pin XJTU giữ riêng</w:t>
+      </w:r>
+    </w:p>
+    <w:p>
+      <w:r>
+        <w:t>Chuyển miền chỉ học trên SDU, không dùng nhãn XJTU:</w:t>
+      </w:r>
+    </w:p>
+    <w:tbl>
+      <w:tblPr>
+        <w:tblStyle w:val="TableGrid"/>
+        <w:tblW w:type="auto" w:w="0"/>
+        <w:tblLook w:firstColumn="1" w:firstRow="1" w:lastColumn="0" w:lastRow="0" w:noHBand="0" w:noVBand="1" w:val="04A0"/>
+      </w:tblPr>
+      <w:tblGrid>
+        <w:gridCol w:w="2197"/>
+        <w:gridCol w:w="2197"/>
+        <w:gridCol w:w="2197"/>
+        <w:gridCol w:w="2197"/>
+      </w:tblGrid>
+      <w:tr>
+        <w:trPr>
+          <w:tblHeader/>
+        </w:trPr>
+        <w:tc>
+          <w:tcPr>
+            <w:tcW w:type="dxa" w:w="2197"/>
+          </w:tcPr>
+          <w:p>
+            <w:pPr>
+              <w:spacing w:line="264" w:lineRule="auto"/>
+            </w:pPr>
+            <w:r>
+              <w:rPr>
+                <w:b/>
+                <w:sz w:val="18"/>
+              </w:rPr>
+              <w:t>model</w:t>
+            </w:r>
+          </w:p>
+        </w:tc>
+        <w:tc>
+          <w:tcPr>
+            <w:tcW w:type="dxa" w:w="2197"/>
+          </w:tcPr>
+          <w:p>
+            <w:pPr>
+              <w:spacing w:line="264" w:lineRule="auto"/>
+            </w:pPr>
+            <w:r>
+              <w:rPr>
+                <w:b/>
+                <w:sz w:val="18"/>
+              </w:rPr>
+              <w:t>mae</w:t>
+            </w:r>
+          </w:p>
+        </w:tc>
+        <w:tc>
+          <w:tcPr>
+            <w:tcW w:type="dxa" w:w="2197"/>
+          </w:tcPr>
+          <w:p>
+            <w:pPr>
+              <w:spacing w:line="264" w:lineRule="auto"/>
+            </w:pPr>
+            <w:r>
+              <w:rPr>
+                <w:b/>
+                <w:sz w:val="18"/>
+              </w:rPr>
+              <w:t>rmse</w:t>
+            </w:r>
+          </w:p>
+        </w:tc>
+        <w:tc>
+          <w:tcPr>
+            <w:tcW w:type="dxa" w:w="2197"/>
+          </w:tcPr>
+          <w:p>
+            <w:pPr>
+              <w:spacing w:line="264" w:lineRule="auto"/>
+            </w:pPr>
+            <w:r>
+              <w:rPr>
+                <w:b/>
+                <w:sz w:val="18"/>
+              </w:rPr>
+              <w:t>r2</w:t>
+            </w:r>
+          </w:p>
+        </w:tc>
+      </w:tr>
+      <w:tr>
+        <w:tc>
+          <w:tcPr>
+            <w:tcW w:type="dxa" w:w="2197"/>
+          </w:tcPr>
+          <w:p>
+            <w:pPr>
+              <w:spacing w:line="264" w:lineRule="auto"/>
+            </w:pPr>
+            <w:r>
+              <w:rPr>
+                <w:b w:val="0"/>
+                <w:sz w:val="18"/>
+              </w:rPr>
+              <w:t>RF normalized</w:t>
+            </w:r>
+          </w:p>
+        </w:tc>
+        <w:tc>
+          <w:tcPr>
+            <w:tcW w:type="dxa" w:w="2197"/>
+          </w:tcPr>
+          <w:p>
+            <w:pPr>
+              <w:spacing w:line="264" w:lineRule="auto"/>
+            </w:pPr>
+            <w:r>
+              <w:rPr>
+                <w:b w:val="0"/>
+                <w:sz w:val="18"/>
+              </w:rPr>
+              <w:t>42.654</w:t>
+            </w:r>
+          </w:p>
+        </w:tc>
+        <w:tc>
+          <w:tcPr>
+            <w:tcW w:type="dxa" w:w="2197"/>
+          </w:tcPr>
+          <w:p>
+            <w:pPr>
+              <w:spacing w:line="264" w:lineRule="auto"/>
+            </w:pPr>
+            <w:r>
+              <w:rPr>
+                <w:b w:val="0"/>
+                <w:sz w:val="18"/>
+              </w:rPr>
+              <w:t>42.910</w:t>
+            </w:r>
+          </w:p>
+        </w:tc>
+        <w:tc>
+          <w:tcPr>
+            <w:tcW w:type="dxa" w:w="2197"/>
+          </w:tcPr>
+          <w:p>
+            <w:pPr>
+              <w:spacing w:line="264" w:lineRule="auto"/>
+            </w:pPr>
+            <w:r>
+              <w:rPr>
+                <w:b w:val="0"/>
+                <w:sz w:val="18"/>
+              </w:rPr>
+              <w:t>-89.595</w:t>
+            </w:r>
+          </w:p>
+        </w:tc>
+      </w:tr>
+      <w:tr>
+        <w:tc>
+          <w:tcPr>
+            <w:tcW w:type="dxa" w:w="2197"/>
+          </w:tcPr>
+          <w:p>
+            <w:pPr>
+              <w:spacing w:line="264" w:lineRule="auto"/>
+            </w:pPr>
+            <w:r>
+              <w:rPr>
+                <w:b w:val="0"/>
+                <w:sz w:val="18"/>
+              </w:rPr>
+              <w:t>RF original SDU</w:t>
+            </w:r>
+          </w:p>
+        </w:tc>
+        <w:tc>
+          <w:tcPr>
+            <w:tcW w:type="dxa" w:w="2197"/>
+          </w:tcPr>
+          <w:p>
+            <w:pPr>
+              <w:spacing w:line="264" w:lineRule="auto"/>
+            </w:pPr>
+            <w:r>
+              <w:rPr>
+                <w:b w:val="0"/>
+                <w:sz w:val="18"/>
+              </w:rPr>
+              <w:t>12.836</w:t>
+            </w:r>
+          </w:p>
+        </w:tc>
+        <w:tc>
+          <w:tcPr>
+            <w:tcW w:type="dxa" w:w="2197"/>
+          </w:tcPr>
+          <w:p>
+            <w:pPr>
+              <w:spacing w:line="264" w:lineRule="auto"/>
+            </w:pPr>
+            <w:r>
+              <w:rPr>
+                <w:b w:val="0"/>
+                <w:sz w:val="18"/>
+              </w:rPr>
+              <w:t>13.649</w:t>
+            </w:r>
+          </w:p>
+        </w:tc>
+        <w:tc>
+          <w:tcPr>
+            <w:tcW w:type="dxa" w:w="2197"/>
+          </w:tcPr>
+          <w:p>
+            <w:pPr>
+              <w:spacing w:line="264" w:lineRule="auto"/>
+            </w:pPr>
+            <w:r>
+              <w:rPr>
+                <w:b w:val="0"/>
+                <w:sz w:val="18"/>
+              </w:rPr>
+              <w:t>-8.045</w:t>
+            </w:r>
+          </w:p>
+        </w:tc>
+      </w:tr>
+    </w:tbl>
+    <w:p>
+      <w:r>
+        <w:t>Các phép kiểm tra batch và bảng theo từng pin nằm trong reports/xjtu và docs/thuc-nghiem-xjtu.md. Kết quả vẫn thuộc tế bào trong phòng thí nghiệm; chưa là bằng chứng mô hình dùng được trên xe.</w:t>
+      </w:r>
+    </w:p>
+    <w:p>
+      <w:pPr>
         <w:pStyle w:val="Heading1"/>
         <w:pageBreakBefore/>
       </w:pPr>
@@ -4781,10 +5660,15 @@
     </w:p>
     <w:p>
       <w:r>
+        <w:t>Mục Thực nghiệm XJTU bổ sung bảng kiểm thử nguồn độc lập, biểu đồ theo pin, nguồn và dự đoán MAT riêng. RF riêng XJTU và RF đa nguồn dùng dòng chuẩn hóa theo dung lượng danh định; điểm refit ứng dụng được phân biệt với kiểm thử pin giữ riêng.</w:t>
+      </w:r>
+    </w:p>
+    <w:p>
+      <w:r>
         <w:drawing>
           <wp:inline xmlns:a="http://schemas.openxmlformats.org/drawingml/2006/main" xmlns:pic="http://schemas.openxmlformats.org/drawingml/2006/picture">
             <wp:extent cx="5508000" cy="3825000"/>
-            <wp:docPr id="6" name="Picture 6"/>
+            <wp:docPr id="7" name="Picture 7"/>
             <wp:cNvGraphicFramePr>
               <a:graphicFrameLocks noChangeAspect="1"/>
             </wp:cNvGraphicFramePr>
@@ -4796,7 +5680,7 @@
                     <pic:cNvPicPr/>
                   </pic:nvPicPr>
                   <pic:blipFill>
-                    <a:blip r:embed="rId15"/>
+                    <a:blip r:embed="rId16"/>
                     <a:stretch>
                       <a:fillRect/>
                     </a:stretch>
@@ -4856,7 +5740,7 @@
     </w:p>
     <w:p>
       <w:r>
-        <w:t>Lần kiểm thử lưu trong reports/pytest-results.xml gồm 74 trường hợp, 0 thất bại, 0 lỗi và 0 bỏ qua. Tệp dataset_check.json ghi kết quả kiểm tra toàn bộ 10.505.065 dòng.</w:t>
+        <w:t>Lần kiểm thử lưu trong reports/pytest-results.xml gồm 82 trường hợp, 0 thất bại, 0 lỗi và 0 bỏ qua. Tệp dataset_check.json ghi kết quả kiểm tra toàn bộ 10.505.065 dòng.</w:t>
       </w:r>
     </w:p>
     <w:p>
@@ -4948,6 +5832,16 @@
     <w:p>
       <w:r>
         <w:t>[8] Liu, F. T., Ting, K. M., &amp; Zhou, Z.-H. (2008). Isolation Forest. IEEE ICDM, 413–422. https://doi.org/10.1109/ICDM.2008.17.</w:t>
+      </w:r>
+    </w:p>
+    <w:p>
+      <w:r>
+        <w:t>[9] Wang, F. (2024). XJTU Battery Dataset [Data set]. Zenodo. https://doi.org/10.5281/zenodo.10963339. CC BY 4.0.</w:t>
+      </w:r>
+    </w:p>
+    <w:p>
+      <w:r>
+        <w:t>[10] Wang, F., Zhai, Z., Zhao, Z., et al. (2024). Physics-informed neural network for lithium-ion battery degradation stable modeling and prognosis. Nature Communications, 15, 4332. https://doi.org/10.1038/s41467-024-48779-z.</w:t>
       </w:r>
     </w:p>
     <w:p>

</xml_diff>